<commit_message>
rerouting CTD to OneDrive
-finished the rerdapp example and brought in the 2024 data
-added a map to the newDoc
</commit_message>
<xml_diff>
--- a/Source Data/CTD/Documents/newDoc_2026-07.docx
+++ b/Source Data/CTD/Documents/newDoc_2026-07.docx
@@ -285,15 +285,7 @@
     </w:p>
     <w:p>
       <w:r>
-        <w:t>Southwest Nova Scotia (SWNS) and the Bay of Fundy (</w:t>
-      </w:r>
-      <w:proofErr w:type="spellStart"/>
-      <w:r>
-        <w:t>BoF</w:t>
-      </w:r>
-      <w:proofErr w:type="spellEnd"/>
-      <w:r>
-        <w:t>) are part of the Gulf of Maine system (Figure 1) and are characterized by strong tides and associated currents, especially in the inner Bay of Fundy where tidal amplitudes are among the largest globally. Current speeds are typically on the order of ~1 m/s in SWNS and 1–1.5 m/s at the entrance of the Minas Channel, increasing to as high as ~4 m/s in the narrows near Cape Split (Greenberg, 1982). Strong tidal mixing produces predominantly well-mixed conditions in much of the Bay (including areas around Grand Manan, Brier Island, and SWNS), while stratification is seasonally reduced during late fall through early spring as surface heating weakens and meteorological forcing increases (Greenberg, 1982). Mean circulation in the upper Bay is largely tidally driven, whereas freshwater runoff plays a larger role in the lower Bay; wave energy in the Bay is typically low (Greenberg, 1982).</w:t>
+        <w:t>Southwest Nova Scotia (SWNS) and the Bay of Fundy (BoF) are part of the Gulf of Maine system (Figure 1) and are characterized by strong tides and associated currents, especially in the inner Bay of Fundy where tidal amplitudes are among the largest globally. Current speeds are typically on the order of ~1 m/s in SWNS and 1–1.5 m/s at the entrance of the Minas Channel, increasing to as high as ~4 m/s in the narrows near Cape Split (Greenberg, 1982). Strong tidal mixing produces predominantly well-mixed conditions in much of the Bay (including areas around Grand Manan, Brier Island, and SWNS), while stratification is seasonally reduced during late fall through early spring as surface heating weakens and meteorological forcing increases (Greenberg, 1982). Mean circulation in the upper Bay is largely tidally driven, whereas freshwater runoff plays a larger role in the lower Bay; wave energy in the Bay is typically low (Greenberg, 1982).</w:t>
       </w:r>
     </w:p>
     <w:p/>
@@ -339,23 +331,7 @@
         <w:t xml:space="preserve"> </w:t>
       </w:r>
       <w:r>
-        <w:t xml:space="preserve">which for Scots Bay started in May or June into September and for German Bank from August to October/November. Depth of the cast varied, with minimum acceptable cast depth of 30m, collecting a continuous profile of the water column. Data from each cast were downloaded from the device to a laptop using the program </w:t>
-      </w:r>
-      <w:proofErr w:type="spellStart"/>
-      <w:r>
-        <w:t>CastAway</w:t>
-      </w:r>
-      <w:proofErr w:type="spellEnd"/>
-      <w:r>
-        <w:t xml:space="preserve"> CTD v1.5 from </w:t>
-      </w:r>
-      <w:proofErr w:type="spellStart"/>
-      <w:r>
-        <w:t>Sontek</w:t>
-      </w:r>
-      <w:proofErr w:type="spellEnd"/>
-      <w:r>
-        <w:t>. Each file was imported as a .csv and brought into R for analyses.</w:t>
+        <w:t>which for Scots Bay started in May or June into September and for German Bank from August to October/November. Depth of the cast varied, with minimum acceptable cast depth of 30m, collecting a continuous profile of the water column. Data from each cast were downloaded from the device to a laptop using the program CastAway CTD v1.5 from Sontek. Each file was imported as a .csv and brought into R for analyses.</w:t>
       </w:r>
     </w:p>
     <w:p>
@@ -375,16 +351,40 @@
         <w:t>website (Coyne et al., 2025)</w:t>
       </w:r>
       <w:r>
+        <w:t xml:space="preserve"> and </w:t>
+      </w:r>
+      <w:r>
+        <w:t>CIOOS Atlantic</w:t>
+      </w:r>
+      <w:r>
         <w:t>.</w:t>
       </w:r>
       <w:r>
         <w:t xml:space="preserve"> </w:t>
       </w:r>
       <w:r>
-        <w:t xml:space="preserve">The CASTS_2024 folder was selected, and V2. The years 2017 to 2024 were downloaded as .nc files and brought into R. </w:t>
-      </w:r>
-      <w:r>
-        <w:t xml:space="preserve">Within R, </w:t>
+        <w:t>From CASTS, t</w:t>
+      </w:r>
+      <w:r>
+        <w:t>he CASTS_2024 folder was selected, and V2.</w:t>
+      </w:r>
+      <w:r>
+        <w:t xml:space="preserve"> The cast measurements are bin averaged</w:t>
+      </w:r>
+      <w:r>
+        <w:t xml:space="preserve"> for each meter</w:t>
+      </w:r>
+      <w:r>
+        <w:t>.</w:t>
+      </w:r>
+      <w:r>
+        <w:t xml:space="preserve"> The years 2017 to 202</w:t>
+      </w:r>
+      <w:r>
+        <w:t>4</w:t>
+      </w:r>
+      <w:r>
+        <w:t xml:space="preserve"> were downloaded as .nc files and brought into R. </w:t>
       </w:r>
     </w:p>
     <w:p/>
@@ -411,12 +411,12 @@
     </w:p>
     <w:p>
       <w:r>
+        <w:lastRenderedPageBreak/>
         <w:t>Best evidence for Prince 5 as a reference station is for temperature. Scots Bay temperature tracks with Prince 5 extremely well. German Bank also tracks reasonably well but with more scatter.</w:t>
       </w:r>
     </w:p>
     <w:p>
       <w:r>
-        <w:lastRenderedPageBreak/>
         <w:t>German Bank is on average, 0.301°C cooler than Prince 5. Scots Bay is on average 0.250 warmer than Prince 5.</w:t>
       </w:r>
     </w:p>
@@ -461,6 +461,7 @@
         <w:rPr>
           <w:rFonts w:eastAsia="Times New Roman"/>
         </w:rPr>
+        <w:lastRenderedPageBreak/>
         <w:t>Discussion</w:t>
       </w:r>
     </w:p>
@@ -482,43 +483,16 @@
     </w:p>
     <w:p>
       <w:r>
-        <w:t xml:space="preserve">Coyne, J., Cyr, F., </w:t>
-      </w:r>
-      <w:proofErr w:type="spellStart"/>
-      <w:r>
-        <w:t>Donnet</w:t>
-      </w:r>
-      <w:proofErr w:type="spellEnd"/>
-      <w:r>
-        <w:t xml:space="preserve">, S., Galbraith, P., Geoffroy, M., Hebert, D., Layton, C., </w:t>
-      </w:r>
-      <w:proofErr w:type="spellStart"/>
-      <w:r>
-        <w:t>Ratsimandresy</w:t>
-      </w:r>
-      <w:proofErr w:type="spellEnd"/>
-      <w:r>
-        <w:t xml:space="preserve">, A., Snook, S., </w:t>
-      </w:r>
-      <w:proofErr w:type="spellStart"/>
-      <w:r>
-        <w:t>Soontiens</w:t>
-      </w:r>
-      <w:proofErr w:type="spellEnd"/>
-      <w:r>
-        <w:t xml:space="preserve">, N., </w:t>
-      </w:r>
-      <w:proofErr w:type="spellStart"/>
-      <w:r>
-        <w:t>Walkusz</w:t>
-      </w:r>
-      <w:proofErr w:type="spellEnd"/>
-      <w:r>
-        <w:t xml:space="preserve">, W., del Rio Iglesias, J., Tel, E. (2025). </w:t>
-      </w:r>
-      <w:r>
-        <w:lastRenderedPageBreak/>
-        <w:t>Canadian Atlantic Shelf Temperature-Salinity (CASTS). Federated Research Data Repository. https://doi.org/10.20383/103.01462</w:t>
+        <w:t>Coyne, J., Cyr, F., Donnet, S., Galbraith, P., Geoffroy, M., Hebert, D., Layton, C., Ratsimandresy, A., Snook, S., Soontiens, N., Walkusz, W., del Rio Iglesias, J., Tel, E. (2025). Canadian Atlantic Shelf Temperature-Salinity (CASTS).</w:t>
+      </w:r>
+      <w:r>
+        <w:t xml:space="preserve"> Version </w:t>
+      </w:r>
+      <w:r>
+        <w:t>2024</w:t>
+      </w:r>
+      <w:r>
+        <w:t xml:space="preserve"> Federated Research Data Repository. https://doi.org/10.20383/103.01462</w:t>
       </w:r>
     </w:p>
     <w:p>
@@ -526,8 +500,6 @@
         <w:pStyle w:val="Heading2"/>
         <w:rPr>
           <w:rFonts w:eastAsia="Times New Roman"/>
-          <w:sz w:val="36"/>
-          <w:szCs w:val="36"/>
         </w:rPr>
       </w:pPr>
       <w:r>
@@ -537,12 +509,81 @@
         <w:t>Figures</w:t>
       </w:r>
     </w:p>
-    <w:p/>
     <w:p>
       <w:r>
         <w:rPr>
           <w:noProof/>
         </w:rPr>
+        <w:drawing>
+          <wp:inline distT="0" distB="0" distL="0" distR="0" wp14:anchorId="33D808A6" wp14:editId="7F71E835">
+            <wp:extent cx="5943600" cy="4384851"/>
+            <wp:effectExtent l="0" t="0" r="0" b="0"/>
+            <wp:docPr id="814544148" name="Picture 3"/>
+            <wp:cNvGraphicFramePr>
+              <a:graphicFrameLocks xmlns:a="http://schemas.openxmlformats.org/drawingml/2006/main" noChangeAspect="1"/>
+            </wp:cNvGraphicFramePr>
+            <a:graphic xmlns:a="http://schemas.openxmlformats.org/drawingml/2006/main">
+              <a:graphicData uri="http://schemas.openxmlformats.org/drawingml/2006/picture">
+                <pic:pic xmlns:pic="http://schemas.openxmlformats.org/drawingml/2006/picture">
+                  <pic:nvPicPr>
+                    <pic:cNvPr id="814544148" name="Picture 814544148"/>
+                    <pic:cNvPicPr/>
+                  </pic:nvPicPr>
+                  <pic:blipFill rotWithShape="1">
+                    <a:blip r:embed="rId8">
+                      <a:extLst>
+                        <a:ext uri="{28A0092B-C50C-407E-A947-70E740481C1C}">
+                          <a14:useLocalDpi xmlns:a14="http://schemas.microsoft.com/office/drawing/2010/main" val="0"/>
+                        </a:ext>
+                      </a:extLst>
+                    </a:blip>
+                    <a:srcRect t="4372"/>
+                    <a:stretch>
+                      <a:fillRect/>
+                    </a:stretch>
+                  </pic:blipFill>
+                  <pic:spPr bwMode="auto">
+                    <a:xfrm>
+                      <a:off x="0" y="0"/>
+                      <a:ext cx="5943600" cy="4384851"/>
+                    </a:xfrm>
+                    <a:prstGeom prst="rect">
+                      <a:avLst/>
+                    </a:prstGeom>
+                    <a:ln>
+                      <a:noFill/>
+                    </a:ln>
+                    <a:extLst>
+                      <a:ext uri="{53640926-AAD7-44D8-BBD7-CCE9431645EC}">
+                        <a14:shadowObscured xmlns:a14="http://schemas.microsoft.com/office/drawing/2010/main"/>
+                      </a:ext>
+                    </a:extLst>
+                  </pic:spPr>
+                </pic:pic>
+              </a:graphicData>
+            </a:graphic>
+          </wp:inline>
+        </w:drawing>
+      </w:r>
+    </w:p>
+    <w:p>
+      <w:r>
+        <w:t xml:space="preserve">Figure X. </w:t>
+      </w:r>
+      <w:r>
+        <w:t xml:space="preserve"> Geographic locations of the three regions for oceanographic comparison</w:t>
+      </w:r>
+      <w:r>
+        <w:t xml:space="preserve">; Prince 5, Scots Bay and German Bank/Seal Island. The cast locations in blue were obtained by the Herring Science Council and all others were obtained by DFO. </w:t>
+      </w:r>
+    </w:p>
+    <w:p/>
+    <w:p>
+      <w:r>
+        <w:rPr>
+          <w:noProof/>
+        </w:rPr>
+        <w:lastRenderedPageBreak/>
         <w:drawing>
           <wp:inline distT="0" distB="0" distL="0" distR="0" wp14:anchorId="2BF83685" wp14:editId="004958C7">
             <wp:extent cx="4540250" cy="3667299"/>
@@ -561,7 +602,7 @@
                     </pic:cNvPicPr>
                   </pic:nvPicPr>
                   <pic:blipFill rotWithShape="1">
-                    <a:blip r:embed="rId8">
+                    <a:blip r:embed="rId9">
                       <a:extLst>
                         <a:ext uri="{28A0092B-C50C-407E-A947-70E740481C1C}">
                           <a14:useLocalDpi xmlns:a14="http://schemas.microsoft.com/office/drawing/2010/main" val="0"/>
@@ -614,7 +655,6 @@
         <w:rPr>
           <w:noProof/>
         </w:rPr>
-        <w:lastRenderedPageBreak/>
         <w:drawing>
           <wp:inline distT="0" distB="0" distL="0" distR="0" wp14:anchorId="4B84409A" wp14:editId="6908FFD7">
             <wp:extent cx="4540250" cy="3677078"/>
@@ -633,7 +673,7 @@
                     </pic:cNvPicPr>
                   </pic:nvPicPr>
                   <pic:blipFill rotWithShape="1">
-                    <a:blip r:embed="rId9">
+                    <a:blip r:embed="rId10">
                       <a:extLst>
                         <a:ext uri="{28A0092B-C50C-407E-A947-70E740481C1C}">
                           <a14:useLocalDpi xmlns:a14="http://schemas.microsoft.com/office/drawing/2010/main" val="0"/>
@@ -672,6 +712,7 @@
     </w:p>
     <w:p>
       <w:r>
+        <w:lastRenderedPageBreak/>
         <w:t xml:space="preserve">Figure X. Monthly mean temperature </w:t>
       </w:r>
       <w:r>
@@ -706,59 +747,6 @@
                 <pic:pic xmlns:pic="http://schemas.openxmlformats.org/drawingml/2006/picture">
                   <pic:nvPicPr>
                     <pic:cNvPr id="0" name="Picture 3"/>
-                    <pic:cNvPicPr>
-                      <a:picLocks noChangeAspect="1" noChangeArrowheads="1"/>
-                    </pic:cNvPicPr>
-                  </pic:nvPicPr>
-                  <pic:blipFill>
-                    <a:blip r:embed="rId10">
-                      <a:extLst>
-                        <a:ext uri="{28A0092B-C50C-407E-A947-70E740481C1C}">
-                          <a14:useLocalDpi xmlns:a14="http://schemas.microsoft.com/office/drawing/2010/main" val="0"/>
-                        </a:ext>
-                      </a:extLst>
-                    </a:blip>
-                    <a:srcRect/>
-                    <a:stretch>
-                      <a:fillRect/>
-                    </a:stretch>
-                  </pic:blipFill>
-                  <pic:spPr bwMode="auto">
-                    <a:xfrm>
-                      <a:off x="0" y="0"/>
-                      <a:ext cx="4540250" cy="3916680"/>
-                    </a:xfrm>
-                    <a:prstGeom prst="rect">
-                      <a:avLst/>
-                    </a:prstGeom>
-                    <a:noFill/>
-                    <a:ln>
-                      <a:noFill/>
-                    </a:ln>
-                  </pic:spPr>
-                </pic:pic>
-              </a:graphicData>
-            </a:graphic>
-          </wp:inline>
-        </w:drawing>
-      </w:r>
-      <w:r>
-        <w:rPr>
-          <w:noProof/>
-        </w:rPr>
-        <w:drawing>
-          <wp:inline distT="0" distB="0" distL="0" distR="0" wp14:anchorId="2A601B93" wp14:editId="7E38F038">
-            <wp:extent cx="4540250" cy="3916680"/>
-            <wp:effectExtent l="0" t="0" r="0" b="7620"/>
-            <wp:docPr id="955590808" name="Picture 4"/>
-            <wp:cNvGraphicFramePr>
-              <a:graphicFrameLocks xmlns:a="http://schemas.openxmlformats.org/drawingml/2006/main" noChangeAspect="1"/>
-            </wp:cNvGraphicFramePr>
-            <a:graphic xmlns:a="http://schemas.openxmlformats.org/drawingml/2006/main">
-              <a:graphicData uri="http://schemas.openxmlformats.org/drawingml/2006/picture">
-                <pic:pic xmlns:pic="http://schemas.openxmlformats.org/drawingml/2006/picture">
-                  <pic:nvPicPr>
-                    <pic:cNvPr id="0" name="Picture 4"/>
                     <pic:cNvPicPr>
                       <a:picLocks noChangeAspect="1" noChangeArrowheads="1"/>
                     </pic:cNvPicPr>
@@ -799,20 +787,11 @@
         <w:rPr>
           <w:noProof/>
         </w:rPr>
-        <w:t xml:space="preserve"> </w:t>
-      </w:r>
-    </w:p>
-    <w:p>
-      <w:r>
-        <w:rPr>
-          <w:noProof/>
-        </w:rPr>
-        <w:lastRenderedPageBreak/>
         <w:drawing>
-          <wp:inline distT="0" distB="0" distL="0" distR="0" wp14:anchorId="6676E438" wp14:editId="7A1E23B6">
+          <wp:inline distT="0" distB="0" distL="0" distR="0" wp14:anchorId="2A601B93" wp14:editId="7E38F038">
             <wp:extent cx="4540250" cy="3916680"/>
             <wp:effectExtent l="0" t="0" r="0" b="7620"/>
-            <wp:docPr id="1967145812" name="Picture 7"/>
+            <wp:docPr id="955590808" name="Picture 4"/>
             <wp:cNvGraphicFramePr>
               <a:graphicFrameLocks xmlns:a="http://schemas.openxmlformats.org/drawingml/2006/main" noChangeAspect="1"/>
             </wp:cNvGraphicFramePr>
@@ -820,7 +799,7 @@
               <a:graphicData uri="http://schemas.openxmlformats.org/drawingml/2006/picture">
                 <pic:pic xmlns:pic="http://schemas.openxmlformats.org/drawingml/2006/picture">
                   <pic:nvPicPr>
-                    <pic:cNvPr id="0" name="Picture 7"/>
+                    <pic:cNvPr id="0" name="Picture 4"/>
                     <pic:cNvPicPr>
                       <a:picLocks noChangeAspect="1" noChangeArrowheads="1"/>
                     </pic:cNvPicPr>
@@ -861,11 +840,20 @@
         <w:rPr>
           <w:noProof/>
         </w:rPr>
+        <w:t xml:space="preserve"> </w:t>
+      </w:r>
+    </w:p>
+    <w:p>
+      <w:r>
+        <w:rPr>
+          <w:noProof/>
+        </w:rPr>
+        <w:lastRenderedPageBreak/>
         <w:drawing>
-          <wp:inline distT="0" distB="0" distL="0" distR="0" wp14:anchorId="0778A830" wp14:editId="3AD8E2CC">
+          <wp:inline distT="0" distB="0" distL="0" distR="0" wp14:anchorId="6676E438" wp14:editId="7A1E23B6">
             <wp:extent cx="4540250" cy="3916680"/>
             <wp:effectExtent l="0" t="0" r="0" b="7620"/>
-            <wp:docPr id="1856588784" name="Picture 6"/>
+            <wp:docPr id="1967145812" name="Picture 7"/>
             <wp:cNvGraphicFramePr>
               <a:graphicFrameLocks xmlns:a="http://schemas.openxmlformats.org/drawingml/2006/main" noChangeAspect="1"/>
             </wp:cNvGraphicFramePr>
@@ -873,7 +861,7 @@
               <a:graphicData uri="http://schemas.openxmlformats.org/drawingml/2006/picture">
                 <pic:pic xmlns:pic="http://schemas.openxmlformats.org/drawingml/2006/picture">
                   <pic:nvPicPr>
-                    <pic:cNvPr id="0" name="Picture 6"/>
+                    <pic:cNvPr id="0" name="Picture 7"/>
                     <pic:cNvPicPr>
                       <a:picLocks noChangeAspect="1" noChangeArrowheads="1"/>
                     </pic:cNvPicPr>
@@ -910,6 +898,59 @@
           </wp:inline>
         </w:drawing>
       </w:r>
+      <w:r>
+        <w:rPr>
+          <w:noProof/>
+        </w:rPr>
+        <w:drawing>
+          <wp:inline distT="0" distB="0" distL="0" distR="0" wp14:anchorId="0778A830" wp14:editId="3AD8E2CC">
+            <wp:extent cx="4540250" cy="3916680"/>
+            <wp:effectExtent l="0" t="0" r="0" b="7620"/>
+            <wp:docPr id="1856588784" name="Picture 6"/>
+            <wp:cNvGraphicFramePr>
+              <a:graphicFrameLocks xmlns:a="http://schemas.openxmlformats.org/drawingml/2006/main" noChangeAspect="1"/>
+            </wp:cNvGraphicFramePr>
+            <a:graphic xmlns:a="http://schemas.openxmlformats.org/drawingml/2006/main">
+              <a:graphicData uri="http://schemas.openxmlformats.org/drawingml/2006/picture">
+                <pic:pic xmlns:pic="http://schemas.openxmlformats.org/drawingml/2006/picture">
+                  <pic:nvPicPr>
+                    <pic:cNvPr id="0" name="Picture 6"/>
+                    <pic:cNvPicPr>
+                      <a:picLocks noChangeAspect="1" noChangeArrowheads="1"/>
+                    </pic:cNvPicPr>
+                  </pic:nvPicPr>
+                  <pic:blipFill>
+                    <a:blip r:embed="rId14">
+                      <a:extLst>
+                        <a:ext uri="{28A0092B-C50C-407E-A947-70E740481C1C}">
+                          <a14:useLocalDpi xmlns:a14="http://schemas.microsoft.com/office/drawing/2010/main" val="0"/>
+                        </a:ext>
+                      </a:extLst>
+                    </a:blip>
+                    <a:srcRect/>
+                    <a:stretch>
+                      <a:fillRect/>
+                    </a:stretch>
+                  </pic:blipFill>
+                  <pic:spPr bwMode="auto">
+                    <a:xfrm>
+                      <a:off x="0" y="0"/>
+                      <a:ext cx="4540250" cy="3916680"/>
+                    </a:xfrm>
+                    <a:prstGeom prst="rect">
+                      <a:avLst/>
+                    </a:prstGeom>
+                    <a:noFill/>
+                    <a:ln>
+                      <a:noFill/>
+                    </a:ln>
+                  </pic:spPr>
+                </pic:pic>
+              </a:graphicData>
+            </a:graphic>
+          </wp:inline>
+        </w:drawing>
+      </w:r>
     </w:p>
     <w:p>
       <w:r>
@@ -935,7 +976,7 @@
                     </pic:cNvPicPr>
                   </pic:nvPicPr>
                   <pic:blipFill>
-                    <a:blip r:embed="rId14" cstate="print">
+                    <a:blip r:embed="rId15" cstate="print">
                       <a:extLst>
                         <a:ext uri="{28A0092B-C50C-407E-A947-70E740481C1C}">
                           <a14:useLocalDpi xmlns:a14="http://schemas.microsoft.com/office/drawing/2010/main" val="0"/>
@@ -968,6 +1009,26 @@
       </w:r>
     </w:p>
     <w:p>
+      <w:r>
+        <w:rPr>
+          <w:noProof/>
+        </w:rPr>
+        <w:drawing>
+          <wp:inline distT="0" distB="0" distL="0" distR="0" wp14:anchorId="15BD4872" wp14:editId="2D5DB371">
+            <wp:extent cx="5486400" cy="3200400"/>
+            <wp:effectExtent l="0" t="0" r="19050" b="38100"/>
+            <wp:docPr id="2046638319" name="Diagram 1"/>
+            <wp:cNvGraphicFramePr/>
+            <a:graphic xmlns:a="http://schemas.openxmlformats.org/drawingml/2006/main">
+              <a:graphicData uri="http://schemas.openxmlformats.org/drawingml/2006/diagram">
+                <dgm:relIds xmlns:dgm="http://schemas.openxmlformats.org/drawingml/2006/diagram" xmlns:r="http://schemas.openxmlformats.org/officeDocument/2006/relationships" r:dm="rId16" r:lo="rId17" r:qs="rId18" r:cs="rId19"/>
+              </a:graphicData>
+            </a:graphic>
+          </wp:inline>
+        </w:drawing>
+      </w:r>
+    </w:p>
+    <w:p>
       <w:pPr>
         <w:pStyle w:val="Heading2"/>
         <w:rPr>
@@ -980,6 +1041,7 @@
         <w:rPr>
           <w:rFonts w:eastAsia="Times New Roman"/>
         </w:rPr>
+        <w:lastRenderedPageBreak/>
         <w:t>Tables</w:t>
       </w:r>
     </w:p>
@@ -1033,7 +1095,6 @@
                 <w14:ligatures w14:val="none"/>
               </w:rPr>
             </w:pPr>
-            <w:proofErr w:type="spellStart"/>
             <w:r>
               <w:rPr>
                 <w:rFonts w:ascii="Aptos Narrow" w:eastAsia="Times New Roman" w:hAnsi="Aptos Narrow" w:cs="Times New Roman"/>
@@ -1046,7 +1107,6 @@
               </w:rPr>
               <w:t>variable_label</w:t>
             </w:r>
-            <w:proofErr w:type="spellEnd"/>
           </w:p>
         </w:tc>
         <w:tc>
@@ -1075,7 +1135,6 @@
                 <w14:ligatures w14:val="none"/>
               </w:rPr>
             </w:pPr>
-            <w:proofErr w:type="spellStart"/>
             <w:r>
               <w:rPr>
                 <w:rFonts w:ascii="Aptos Narrow" w:eastAsia="Times New Roman" w:hAnsi="Aptos Narrow" w:cs="Times New Roman"/>
@@ -1088,7 +1147,6 @@
               </w:rPr>
               <w:t>comparison_area</w:t>
             </w:r>
-            <w:proofErr w:type="spellEnd"/>
           </w:p>
         </w:tc>
         <w:tc>
@@ -1117,7 +1175,6 @@
                 <w14:ligatures w14:val="none"/>
               </w:rPr>
             </w:pPr>
-            <w:proofErr w:type="spellStart"/>
             <w:r>
               <w:rPr>
                 <w:rFonts w:ascii="Aptos Narrow" w:eastAsia="Times New Roman" w:hAnsi="Aptos Narrow" w:cs="Times New Roman"/>
@@ -1130,7 +1187,6 @@
               </w:rPr>
               <w:t>n_paired</w:t>
             </w:r>
-            <w:proofErr w:type="spellEnd"/>
           </w:p>
         </w:tc>
         <w:tc>
@@ -1159,7 +1215,6 @@
                 <w14:ligatures w14:val="none"/>
               </w:rPr>
             </w:pPr>
-            <w:proofErr w:type="spellStart"/>
             <w:r>
               <w:rPr>
                 <w:rFonts w:ascii="Aptos Narrow" w:eastAsia="Times New Roman" w:hAnsi="Aptos Narrow" w:cs="Times New Roman"/>
@@ -1172,7 +1227,6 @@
               </w:rPr>
               <w:t>pearson_r</w:t>
             </w:r>
-            <w:proofErr w:type="spellEnd"/>
           </w:p>
         </w:tc>
         <w:tc>
@@ -1201,7 +1255,6 @@
                 <w14:ligatures w14:val="none"/>
               </w:rPr>
             </w:pPr>
-            <w:proofErr w:type="spellStart"/>
             <w:r>
               <w:rPr>
                 <w:rFonts w:ascii="Aptos Narrow" w:eastAsia="Times New Roman" w:hAnsi="Aptos Narrow" w:cs="Times New Roman"/>
@@ -1214,7 +1267,6 @@
               </w:rPr>
               <w:t>mean_difference</w:t>
             </w:r>
-            <w:proofErr w:type="spellEnd"/>
           </w:p>
         </w:tc>
         <w:tc>
@@ -1243,7 +1295,6 @@
                 <w14:ligatures w14:val="none"/>
               </w:rPr>
             </w:pPr>
-            <w:proofErr w:type="spellStart"/>
             <w:r>
               <w:rPr>
                 <w:rFonts w:ascii="Aptos Narrow" w:eastAsia="Times New Roman" w:hAnsi="Aptos Narrow" w:cs="Times New Roman"/>
@@ -1256,7 +1307,6 @@
               </w:rPr>
               <w:t>rmse</w:t>
             </w:r>
-            <w:proofErr w:type="spellEnd"/>
           </w:p>
         </w:tc>
         <w:tc>
@@ -1285,7 +1335,6 @@
                 <w14:ligatures w14:val="none"/>
               </w:rPr>
             </w:pPr>
-            <w:proofErr w:type="spellStart"/>
             <w:r>
               <w:rPr>
                 <w:rFonts w:ascii="Aptos Narrow" w:eastAsia="Times New Roman" w:hAnsi="Aptos Narrow" w:cs="Times New Roman"/>
@@ -1298,7 +1347,6 @@
               </w:rPr>
               <w:t>mae</w:t>
             </w:r>
-            <w:proofErr w:type="spellEnd"/>
           </w:p>
         </w:tc>
       </w:tr>
@@ -4211,7 +4259,6 @@
     </w:p>
     <w:p>
       <w:r>
-        <w:lastRenderedPageBreak/>
         <w:t xml:space="preserve">RMSE – root mean square error, measures the typical size of prediction errors. Lower is better. Formula is sqrt(mean(difference^2)). Because differences are squared, large discrepancies are penalized heavily. RMSE of 0.74°C means typical disagreement between Scots Bay and Prince 5 is about 0.74°C. </w:t>
       </w:r>
       <w:r>
@@ -5834,6 +5881,3039 @@
 </w:styles>
 </file>
 
+<file path=word/diagrams/colors1.xml><?xml version="1.0" encoding="utf-8"?>
+<dgm:colorsDef xmlns:dgm="http://schemas.openxmlformats.org/drawingml/2006/diagram" xmlns:a="http://schemas.openxmlformats.org/drawingml/2006/main" uniqueId="urn:microsoft.com/office/officeart/2005/8/colors/accent1_2">
+  <dgm:title val=""/>
+  <dgm:desc val=""/>
+  <dgm:catLst>
+    <dgm:cat type="accent1" pri="11200"/>
+  </dgm:catLst>
+  <dgm:styleLbl name="node0">
+    <dgm:fillClrLst meth="repeat">
+      <a:schemeClr val="accent1"/>
+    </dgm:fillClrLst>
+    <dgm:linClrLst meth="repeat">
+      <a:schemeClr val="lt1"/>
+    </dgm:linClrLst>
+    <dgm:effectClrLst/>
+    <dgm:txLinClrLst/>
+    <dgm:txFillClrLst/>
+    <dgm:txEffectClrLst/>
+  </dgm:styleLbl>
+  <dgm:styleLbl name="alignNode1">
+    <dgm:fillClrLst meth="repeat">
+      <a:schemeClr val="accent1"/>
+    </dgm:fillClrLst>
+    <dgm:linClrLst meth="repeat">
+      <a:schemeClr val="accent1"/>
+    </dgm:linClrLst>
+    <dgm:effectClrLst/>
+    <dgm:txLinClrLst/>
+    <dgm:txFillClrLst/>
+    <dgm:txEffectClrLst/>
+  </dgm:styleLbl>
+  <dgm:styleLbl name="node1">
+    <dgm:fillClrLst meth="repeat">
+      <a:schemeClr val="accent1"/>
+    </dgm:fillClrLst>
+    <dgm:linClrLst meth="repeat">
+      <a:schemeClr val="lt1"/>
+    </dgm:linClrLst>
+    <dgm:effectClrLst/>
+    <dgm:txLinClrLst/>
+    <dgm:txFillClrLst/>
+    <dgm:txEffectClrLst/>
+  </dgm:styleLbl>
+  <dgm:styleLbl name="lnNode1">
+    <dgm:fillClrLst meth="repeat">
+      <a:schemeClr val="accent1"/>
+    </dgm:fillClrLst>
+    <dgm:linClrLst meth="repeat">
+      <a:schemeClr val="lt1"/>
+    </dgm:linClrLst>
+    <dgm:effectClrLst/>
+    <dgm:txLinClrLst/>
+    <dgm:txFillClrLst/>
+    <dgm:txEffectClrLst/>
+  </dgm:styleLbl>
+  <dgm:styleLbl name="vennNode1">
+    <dgm:fillClrLst meth="repeat">
+      <a:schemeClr val="accent1">
+        <a:alpha val="50000"/>
+      </a:schemeClr>
+    </dgm:fillClrLst>
+    <dgm:linClrLst meth="repeat">
+      <a:schemeClr val="lt1"/>
+    </dgm:linClrLst>
+    <dgm:effectClrLst/>
+    <dgm:txLinClrLst/>
+    <dgm:txFillClrLst/>
+    <dgm:txEffectClrLst/>
+  </dgm:styleLbl>
+  <dgm:styleLbl name="node2">
+    <dgm:fillClrLst meth="repeat">
+      <a:schemeClr val="accent1"/>
+    </dgm:fillClrLst>
+    <dgm:linClrLst meth="repeat">
+      <a:schemeClr val="lt1"/>
+    </dgm:linClrLst>
+    <dgm:effectClrLst/>
+    <dgm:txLinClrLst/>
+    <dgm:txFillClrLst/>
+    <dgm:txEffectClrLst/>
+  </dgm:styleLbl>
+  <dgm:styleLbl name="node3">
+    <dgm:fillClrLst meth="repeat">
+      <a:schemeClr val="accent1"/>
+    </dgm:fillClrLst>
+    <dgm:linClrLst meth="repeat">
+      <a:schemeClr val="lt1"/>
+    </dgm:linClrLst>
+    <dgm:effectClrLst/>
+    <dgm:txLinClrLst/>
+    <dgm:txFillClrLst/>
+    <dgm:txEffectClrLst/>
+  </dgm:styleLbl>
+  <dgm:styleLbl name="node4">
+    <dgm:fillClrLst meth="repeat">
+      <a:schemeClr val="accent1"/>
+    </dgm:fillClrLst>
+    <dgm:linClrLst meth="repeat">
+      <a:schemeClr val="lt1"/>
+    </dgm:linClrLst>
+    <dgm:effectClrLst/>
+    <dgm:txLinClrLst/>
+    <dgm:txFillClrLst/>
+    <dgm:txEffectClrLst/>
+  </dgm:styleLbl>
+  <dgm:styleLbl name="fgImgPlace1">
+    <dgm:fillClrLst meth="repeat">
+      <a:schemeClr val="accent1">
+        <a:tint val="50000"/>
+      </a:schemeClr>
+    </dgm:fillClrLst>
+    <dgm:linClrLst meth="repeat">
+      <a:schemeClr val="lt1"/>
+    </dgm:linClrLst>
+    <dgm:effectClrLst/>
+    <dgm:txLinClrLst/>
+    <dgm:txFillClrLst meth="repeat">
+      <a:schemeClr val="lt1"/>
+    </dgm:txFillClrLst>
+    <dgm:txEffectClrLst/>
+  </dgm:styleLbl>
+  <dgm:styleLbl name="alignImgPlace1">
+    <dgm:fillClrLst meth="repeat">
+      <a:schemeClr val="accent1">
+        <a:tint val="50000"/>
+      </a:schemeClr>
+    </dgm:fillClrLst>
+    <dgm:linClrLst meth="repeat">
+      <a:schemeClr val="lt1"/>
+    </dgm:linClrLst>
+    <dgm:effectClrLst/>
+    <dgm:txLinClrLst/>
+    <dgm:txFillClrLst meth="repeat">
+      <a:schemeClr val="lt1"/>
+    </dgm:txFillClrLst>
+    <dgm:txEffectClrLst/>
+  </dgm:styleLbl>
+  <dgm:styleLbl name="bgImgPlace1">
+    <dgm:fillClrLst meth="repeat">
+      <a:schemeClr val="accent1">
+        <a:tint val="50000"/>
+      </a:schemeClr>
+    </dgm:fillClrLst>
+    <dgm:linClrLst meth="repeat">
+      <a:schemeClr val="lt1"/>
+    </dgm:linClrLst>
+    <dgm:effectClrLst/>
+    <dgm:txLinClrLst/>
+    <dgm:txFillClrLst meth="repeat">
+      <a:schemeClr val="lt1"/>
+    </dgm:txFillClrLst>
+    <dgm:txEffectClrLst/>
+  </dgm:styleLbl>
+  <dgm:styleLbl name="sibTrans2D1">
+    <dgm:fillClrLst meth="repeat">
+      <a:schemeClr val="accent1">
+        <a:tint val="60000"/>
+      </a:schemeClr>
+    </dgm:fillClrLst>
+    <dgm:linClrLst meth="repeat">
+      <a:schemeClr val="accent1">
+        <a:tint val="60000"/>
+      </a:schemeClr>
+    </dgm:linClrLst>
+    <dgm:effectClrLst/>
+    <dgm:txLinClrLst/>
+    <dgm:txFillClrLst/>
+    <dgm:txEffectClrLst/>
+  </dgm:styleLbl>
+  <dgm:styleLbl name="fgSibTrans2D1">
+    <dgm:fillClrLst meth="repeat">
+      <a:schemeClr val="accent1">
+        <a:tint val="60000"/>
+      </a:schemeClr>
+    </dgm:fillClrLst>
+    <dgm:linClrLst meth="repeat">
+      <a:schemeClr val="accent1">
+        <a:tint val="60000"/>
+      </a:schemeClr>
+    </dgm:linClrLst>
+    <dgm:effectClrLst/>
+    <dgm:txLinClrLst/>
+    <dgm:txFillClrLst/>
+    <dgm:txEffectClrLst/>
+  </dgm:styleLbl>
+  <dgm:styleLbl name="bgSibTrans2D1">
+    <dgm:fillClrLst meth="repeat">
+      <a:schemeClr val="accent1">
+        <a:tint val="60000"/>
+      </a:schemeClr>
+    </dgm:fillClrLst>
+    <dgm:linClrLst meth="repeat">
+      <a:schemeClr val="accent1">
+        <a:tint val="60000"/>
+      </a:schemeClr>
+    </dgm:linClrLst>
+    <dgm:effectClrLst/>
+    <dgm:txLinClrLst/>
+    <dgm:txFillClrLst/>
+    <dgm:txEffectClrLst/>
+  </dgm:styleLbl>
+  <dgm:styleLbl name="sibTrans1D1">
+    <dgm:fillClrLst meth="repeat">
+      <a:schemeClr val="accent1"/>
+    </dgm:fillClrLst>
+    <dgm:linClrLst meth="repeat">
+      <a:schemeClr val="accent1"/>
+    </dgm:linClrLst>
+    <dgm:effectClrLst/>
+    <dgm:txLinClrLst/>
+    <dgm:txFillClrLst meth="repeat">
+      <a:schemeClr val="tx1"/>
+    </dgm:txFillClrLst>
+    <dgm:txEffectClrLst/>
+  </dgm:styleLbl>
+  <dgm:styleLbl name="callout">
+    <dgm:fillClrLst meth="repeat">
+      <a:schemeClr val="accent1"/>
+    </dgm:fillClrLst>
+    <dgm:linClrLst meth="repeat">
+      <a:schemeClr val="accent1">
+        <a:tint val="50000"/>
+      </a:schemeClr>
+    </dgm:linClrLst>
+    <dgm:effectClrLst/>
+    <dgm:txLinClrLst/>
+    <dgm:txFillClrLst meth="repeat">
+      <a:schemeClr val="tx1"/>
+    </dgm:txFillClrLst>
+    <dgm:txEffectClrLst/>
+  </dgm:styleLbl>
+  <dgm:styleLbl name="asst0">
+    <dgm:fillClrLst meth="repeat">
+      <a:schemeClr val="accent1"/>
+    </dgm:fillClrLst>
+    <dgm:linClrLst meth="repeat">
+      <a:schemeClr val="lt1"/>
+    </dgm:linClrLst>
+    <dgm:effectClrLst/>
+    <dgm:txLinClrLst/>
+    <dgm:txFillClrLst/>
+    <dgm:txEffectClrLst/>
+  </dgm:styleLbl>
+  <dgm:styleLbl name="asst1">
+    <dgm:fillClrLst meth="repeat">
+      <a:schemeClr val="accent1"/>
+    </dgm:fillClrLst>
+    <dgm:linClrLst meth="repeat">
+      <a:schemeClr val="lt1"/>
+    </dgm:linClrLst>
+    <dgm:effectClrLst/>
+    <dgm:txLinClrLst/>
+    <dgm:txFillClrLst/>
+    <dgm:txEffectClrLst/>
+  </dgm:styleLbl>
+  <dgm:styleLbl name="asst2">
+    <dgm:fillClrLst meth="repeat">
+      <a:schemeClr val="accent1"/>
+    </dgm:fillClrLst>
+    <dgm:linClrLst meth="repeat">
+      <a:schemeClr val="lt1"/>
+    </dgm:linClrLst>
+    <dgm:effectClrLst/>
+    <dgm:txLinClrLst/>
+    <dgm:txFillClrLst/>
+    <dgm:txEffectClrLst/>
+  </dgm:styleLbl>
+  <dgm:styleLbl name="asst3">
+    <dgm:fillClrLst meth="repeat">
+      <a:schemeClr val="accent1"/>
+    </dgm:fillClrLst>
+    <dgm:linClrLst meth="repeat">
+      <a:schemeClr val="lt1"/>
+    </dgm:linClrLst>
+    <dgm:effectClrLst/>
+    <dgm:txLinClrLst/>
+    <dgm:txFillClrLst/>
+    <dgm:txEffectClrLst/>
+  </dgm:styleLbl>
+  <dgm:styleLbl name="asst4">
+    <dgm:fillClrLst meth="repeat">
+      <a:schemeClr val="accent1"/>
+    </dgm:fillClrLst>
+    <dgm:linClrLst meth="repeat">
+      <a:schemeClr val="lt1"/>
+    </dgm:linClrLst>
+    <dgm:effectClrLst/>
+    <dgm:txLinClrLst/>
+    <dgm:txFillClrLst/>
+    <dgm:txEffectClrLst/>
+  </dgm:styleLbl>
+  <dgm:styleLbl name="parChTrans2D1">
+    <dgm:fillClrLst meth="repeat">
+      <a:schemeClr val="accent1">
+        <a:tint val="60000"/>
+      </a:schemeClr>
+    </dgm:fillClrLst>
+    <dgm:linClrLst meth="repeat">
+      <a:schemeClr val="accent1">
+        <a:tint val="60000"/>
+      </a:schemeClr>
+    </dgm:linClrLst>
+    <dgm:effectClrLst/>
+    <dgm:txLinClrLst/>
+    <dgm:txFillClrLst meth="repeat">
+      <a:schemeClr val="lt1"/>
+    </dgm:txFillClrLst>
+    <dgm:txEffectClrLst/>
+  </dgm:styleLbl>
+  <dgm:styleLbl name="parChTrans2D2">
+    <dgm:fillClrLst meth="repeat">
+      <a:schemeClr val="accent1"/>
+    </dgm:fillClrLst>
+    <dgm:linClrLst meth="repeat">
+      <a:schemeClr val="accent1"/>
+    </dgm:linClrLst>
+    <dgm:effectClrLst/>
+    <dgm:txLinClrLst/>
+    <dgm:txFillClrLst meth="repeat">
+      <a:schemeClr val="lt1"/>
+    </dgm:txFillClrLst>
+    <dgm:txEffectClrLst/>
+  </dgm:styleLbl>
+  <dgm:styleLbl name="parChTrans2D3">
+    <dgm:fillClrLst meth="repeat">
+      <a:schemeClr val="accent1"/>
+    </dgm:fillClrLst>
+    <dgm:linClrLst meth="repeat">
+      <a:schemeClr val="accent1"/>
+    </dgm:linClrLst>
+    <dgm:effectClrLst/>
+    <dgm:txLinClrLst/>
+    <dgm:txFillClrLst meth="repeat">
+      <a:schemeClr val="lt1"/>
+    </dgm:txFillClrLst>
+    <dgm:txEffectClrLst/>
+  </dgm:styleLbl>
+  <dgm:styleLbl name="parChTrans2D4">
+    <dgm:fillClrLst meth="repeat">
+      <a:schemeClr val="accent1"/>
+    </dgm:fillClrLst>
+    <dgm:linClrLst meth="repeat">
+      <a:schemeClr val="accent1"/>
+    </dgm:linClrLst>
+    <dgm:effectClrLst/>
+    <dgm:txLinClrLst/>
+    <dgm:txFillClrLst meth="repeat">
+      <a:schemeClr val="lt1"/>
+    </dgm:txFillClrLst>
+    <dgm:txEffectClrLst/>
+  </dgm:styleLbl>
+  <dgm:styleLbl name="parChTrans1D1">
+    <dgm:fillClrLst meth="repeat">
+      <a:schemeClr val="accent1"/>
+    </dgm:fillClrLst>
+    <dgm:linClrLst meth="repeat">
+      <a:schemeClr val="accent1">
+        <a:shade val="60000"/>
+      </a:schemeClr>
+    </dgm:linClrLst>
+    <dgm:effectClrLst/>
+    <dgm:txLinClrLst/>
+    <dgm:txFillClrLst meth="repeat">
+      <a:schemeClr val="tx1"/>
+    </dgm:txFillClrLst>
+    <dgm:txEffectClrLst/>
+  </dgm:styleLbl>
+  <dgm:styleLbl name="parChTrans1D2">
+    <dgm:fillClrLst meth="repeat">
+      <a:schemeClr val="accent1"/>
+    </dgm:fillClrLst>
+    <dgm:linClrLst meth="repeat">
+      <a:schemeClr val="accent1">
+        <a:shade val="60000"/>
+      </a:schemeClr>
+    </dgm:linClrLst>
+    <dgm:effectClrLst/>
+    <dgm:txLinClrLst/>
+    <dgm:txFillClrLst meth="repeat">
+      <a:schemeClr val="tx1"/>
+    </dgm:txFillClrLst>
+    <dgm:txEffectClrLst/>
+  </dgm:styleLbl>
+  <dgm:styleLbl name="parChTrans1D3">
+    <dgm:fillClrLst meth="repeat">
+      <a:schemeClr val="accent1"/>
+    </dgm:fillClrLst>
+    <dgm:linClrLst meth="repeat">
+      <a:schemeClr val="accent1">
+        <a:shade val="80000"/>
+      </a:schemeClr>
+    </dgm:linClrLst>
+    <dgm:effectClrLst/>
+    <dgm:txLinClrLst/>
+    <dgm:txFillClrLst meth="repeat">
+      <a:schemeClr val="tx1"/>
+    </dgm:txFillClrLst>
+    <dgm:txEffectClrLst/>
+  </dgm:styleLbl>
+  <dgm:styleLbl name="parChTrans1D4">
+    <dgm:fillClrLst meth="repeat">
+      <a:schemeClr val="accent1"/>
+    </dgm:fillClrLst>
+    <dgm:linClrLst meth="repeat">
+      <a:schemeClr val="accent1">
+        <a:shade val="80000"/>
+      </a:schemeClr>
+    </dgm:linClrLst>
+    <dgm:effectClrLst/>
+    <dgm:txLinClrLst/>
+    <dgm:txFillClrLst meth="repeat">
+      <a:schemeClr val="tx1"/>
+    </dgm:txFillClrLst>
+    <dgm:txEffectClrLst/>
+  </dgm:styleLbl>
+  <dgm:styleLbl name="fgAcc1">
+    <dgm:fillClrLst meth="repeat">
+      <a:schemeClr val="lt1">
+        <a:alpha val="90000"/>
+      </a:schemeClr>
+    </dgm:fillClrLst>
+    <dgm:linClrLst meth="repeat">
+      <a:schemeClr val="accent1"/>
+    </dgm:linClrLst>
+    <dgm:effectClrLst/>
+    <dgm:txLinClrLst/>
+    <dgm:txFillClrLst meth="repeat">
+      <a:schemeClr val="dk1"/>
+    </dgm:txFillClrLst>
+    <dgm:txEffectClrLst/>
+  </dgm:styleLbl>
+  <dgm:styleLbl name="conFgAcc1">
+    <dgm:fillClrLst meth="repeat">
+      <a:schemeClr val="lt1">
+        <a:alpha val="90000"/>
+      </a:schemeClr>
+    </dgm:fillClrLst>
+    <dgm:linClrLst meth="repeat">
+      <a:schemeClr val="accent1"/>
+    </dgm:linClrLst>
+    <dgm:effectClrLst/>
+    <dgm:txLinClrLst/>
+    <dgm:txFillClrLst meth="repeat">
+      <a:schemeClr val="dk1"/>
+    </dgm:txFillClrLst>
+    <dgm:txEffectClrLst/>
+  </dgm:styleLbl>
+  <dgm:styleLbl name="alignAcc1">
+    <dgm:fillClrLst meth="repeat">
+      <a:schemeClr val="lt1">
+        <a:alpha val="90000"/>
+      </a:schemeClr>
+    </dgm:fillClrLst>
+    <dgm:linClrLst meth="repeat">
+      <a:schemeClr val="accent1"/>
+    </dgm:linClrLst>
+    <dgm:effectClrLst/>
+    <dgm:txLinClrLst/>
+    <dgm:txFillClrLst meth="repeat">
+      <a:schemeClr val="dk1"/>
+    </dgm:txFillClrLst>
+    <dgm:txEffectClrLst/>
+  </dgm:styleLbl>
+  <dgm:styleLbl name="trAlignAcc1">
+    <dgm:fillClrLst meth="repeat">
+      <a:schemeClr val="lt1">
+        <a:alpha val="40000"/>
+      </a:schemeClr>
+    </dgm:fillClrLst>
+    <dgm:linClrLst meth="repeat">
+      <a:schemeClr val="accent1"/>
+    </dgm:linClrLst>
+    <dgm:effectClrLst/>
+    <dgm:txLinClrLst/>
+    <dgm:txFillClrLst meth="repeat">
+      <a:schemeClr val="dk1"/>
+    </dgm:txFillClrLst>
+    <dgm:txEffectClrLst/>
+  </dgm:styleLbl>
+  <dgm:styleLbl name="bgAcc1">
+    <dgm:fillClrLst meth="repeat">
+      <a:schemeClr val="lt1">
+        <a:alpha val="90000"/>
+      </a:schemeClr>
+    </dgm:fillClrLst>
+    <dgm:linClrLst meth="repeat">
+      <a:schemeClr val="accent1"/>
+    </dgm:linClrLst>
+    <dgm:effectClrLst/>
+    <dgm:txLinClrLst/>
+    <dgm:txFillClrLst meth="repeat">
+      <a:schemeClr val="dk1"/>
+    </dgm:txFillClrLst>
+    <dgm:txEffectClrLst/>
+  </dgm:styleLbl>
+  <dgm:styleLbl name="solidFgAcc1">
+    <dgm:fillClrLst meth="repeat">
+      <a:schemeClr val="lt1"/>
+    </dgm:fillClrLst>
+    <dgm:linClrLst meth="repeat">
+      <a:schemeClr val="accent1"/>
+    </dgm:linClrLst>
+    <dgm:effectClrLst/>
+    <dgm:txLinClrLst/>
+    <dgm:txFillClrLst meth="repeat">
+      <a:schemeClr val="dk1"/>
+    </dgm:txFillClrLst>
+    <dgm:txEffectClrLst/>
+  </dgm:styleLbl>
+  <dgm:styleLbl name="solidAlignAcc1">
+    <dgm:fillClrLst meth="repeat">
+      <a:schemeClr val="lt1"/>
+    </dgm:fillClrLst>
+    <dgm:linClrLst meth="repeat">
+      <a:schemeClr val="accent1"/>
+    </dgm:linClrLst>
+    <dgm:effectClrLst/>
+    <dgm:txLinClrLst/>
+    <dgm:txFillClrLst meth="repeat">
+      <a:schemeClr val="dk1"/>
+    </dgm:txFillClrLst>
+    <dgm:txEffectClrLst/>
+  </dgm:styleLbl>
+  <dgm:styleLbl name="solidBgAcc1">
+    <dgm:fillClrLst meth="repeat">
+      <a:schemeClr val="lt1"/>
+    </dgm:fillClrLst>
+    <dgm:linClrLst meth="repeat">
+      <a:schemeClr val="accent1"/>
+    </dgm:linClrLst>
+    <dgm:effectClrLst/>
+    <dgm:txLinClrLst/>
+    <dgm:txFillClrLst meth="repeat">
+      <a:schemeClr val="dk1"/>
+    </dgm:txFillClrLst>
+    <dgm:txEffectClrLst/>
+  </dgm:styleLbl>
+  <dgm:styleLbl name="fgAccFollowNode1">
+    <dgm:fillClrLst meth="repeat">
+      <a:schemeClr val="accent1">
+        <a:alpha val="90000"/>
+        <a:tint val="40000"/>
+      </a:schemeClr>
+    </dgm:fillClrLst>
+    <dgm:linClrLst meth="repeat">
+      <a:schemeClr val="accent1">
+        <a:alpha val="90000"/>
+        <a:tint val="40000"/>
+      </a:schemeClr>
+    </dgm:linClrLst>
+    <dgm:effectClrLst/>
+    <dgm:txLinClrLst/>
+    <dgm:txFillClrLst meth="repeat">
+      <a:schemeClr val="dk1"/>
+    </dgm:txFillClrLst>
+    <dgm:txEffectClrLst/>
+  </dgm:styleLbl>
+  <dgm:styleLbl name="alignAccFollowNode1">
+    <dgm:fillClrLst meth="repeat">
+      <a:schemeClr val="accent1">
+        <a:alpha val="90000"/>
+        <a:tint val="40000"/>
+      </a:schemeClr>
+    </dgm:fillClrLst>
+    <dgm:linClrLst meth="repeat">
+      <a:schemeClr val="accent1">
+        <a:alpha val="90000"/>
+        <a:tint val="40000"/>
+      </a:schemeClr>
+    </dgm:linClrLst>
+    <dgm:effectClrLst/>
+    <dgm:txLinClrLst/>
+    <dgm:txFillClrLst meth="repeat">
+      <a:schemeClr val="dk1"/>
+    </dgm:txFillClrLst>
+    <dgm:txEffectClrLst/>
+  </dgm:styleLbl>
+  <dgm:styleLbl name="bgAccFollowNode1">
+    <dgm:fillClrLst meth="repeat">
+      <a:schemeClr val="accent1">
+        <a:alpha val="90000"/>
+        <a:tint val="40000"/>
+      </a:schemeClr>
+    </dgm:fillClrLst>
+    <dgm:linClrLst meth="repeat">
+      <a:schemeClr val="accent1">
+        <a:alpha val="90000"/>
+        <a:tint val="40000"/>
+      </a:schemeClr>
+    </dgm:linClrLst>
+    <dgm:effectClrLst/>
+    <dgm:txLinClrLst/>
+    <dgm:txFillClrLst meth="repeat">
+      <a:schemeClr val="dk1"/>
+    </dgm:txFillClrLst>
+    <dgm:txEffectClrLst/>
+  </dgm:styleLbl>
+  <dgm:styleLbl name="fgAcc0">
+    <dgm:fillClrLst meth="repeat">
+      <a:schemeClr val="lt1">
+        <a:alpha val="90000"/>
+      </a:schemeClr>
+    </dgm:fillClrLst>
+    <dgm:linClrLst meth="repeat">
+      <a:schemeClr val="accent1"/>
+    </dgm:linClrLst>
+    <dgm:effectClrLst/>
+    <dgm:txLinClrLst/>
+    <dgm:txFillClrLst meth="repeat">
+      <a:schemeClr val="dk1"/>
+    </dgm:txFillClrLst>
+    <dgm:txEffectClrLst/>
+  </dgm:styleLbl>
+  <dgm:styleLbl name="fgAcc2">
+    <dgm:fillClrLst meth="repeat">
+      <a:schemeClr val="lt1">
+        <a:alpha val="90000"/>
+      </a:schemeClr>
+    </dgm:fillClrLst>
+    <dgm:linClrLst meth="repeat">
+      <a:schemeClr val="accent1"/>
+    </dgm:linClrLst>
+    <dgm:effectClrLst/>
+    <dgm:txLinClrLst/>
+    <dgm:txFillClrLst meth="repeat">
+      <a:schemeClr val="dk1"/>
+    </dgm:txFillClrLst>
+    <dgm:txEffectClrLst/>
+  </dgm:styleLbl>
+  <dgm:styleLbl name="fgAcc3">
+    <dgm:fillClrLst meth="repeat">
+      <a:schemeClr val="lt1">
+        <a:alpha val="90000"/>
+      </a:schemeClr>
+    </dgm:fillClrLst>
+    <dgm:linClrLst meth="repeat">
+      <a:schemeClr val="accent1"/>
+    </dgm:linClrLst>
+    <dgm:effectClrLst/>
+    <dgm:txLinClrLst/>
+    <dgm:txFillClrLst meth="repeat">
+      <a:schemeClr val="dk1"/>
+    </dgm:txFillClrLst>
+    <dgm:txEffectClrLst/>
+  </dgm:styleLbl>
+  <dgm:styleLbl name="fgAcc4">
+    <dgm:fillClrLst meth="repeat">
+      <a:schemeClr val="lt1">
+        <a:alpha val="90000"/>
+      </a:schemeClr>
+    </dgm:fillClrLst>
+    <dgm:linClrLst meth="repeat">
+      <a:schemeClr val="accent1"/>
+    </dgm:linClrLst>
+    <dgm:effectClrLst/>
+    <dgm:txLinClrLst/>
+    <dgm:txFillClrLst meth="repeat">
+      <a:schemeClr val="dk1"/>
+    </dgm:txFillClrLst>
+    <dgm:txEffectClrLst/>
+  </dgm:styleLbl>
+  <dgm:styleLbl name="bgShp">
+    <dgm:fillClrLst meth="repeat">
+      <a:schemeClr val="accent1">
+        <a:tint val="40000"/>
+      </a:schemeClr>
+    </dgm:fillClrLst>
+    <dgm:linClrLst meth="repeat">
+      <a:schemeClr val="accent1"/>
+    </dgm:linClrLst>
+    <dgm:effectClrLst/>
+    <dgm:txLinClrLst/>
+    <dgm:txFillClrLst meth="repeat">
+      <a:schemeClr val="dk1"/>
+    </dgm:txFillClrLst>
+    <dgm:txEffectClrLst/>
+  </dgm:styleLbl>
+  <dgm:styleLbl name="dkBgShp">
+    <dgm:fillClrLst meth="repeat">
+      <a:schemeClr val="accent1">
+        <a:shade val="80000"/>
+      </a:schemeClr>
+    </dgm:fillClrLst>
+    <dgm:linClrLst meth="repeat">
+      <a:schemeClr val="accent1"/>
+    </dgm:linClrLst>
+    <dgm:effectClrLst/>
+    <dgm:txLinClrLst/>
+    <dgm:txFillClrLst meth="repeat">
+      <a:schemeClr val="lt1"/>
+    </dgm:txFillClrLst>
+    <dgm:txEffectClrLst/>
+  </dgm:styleLbl>
+  <dgm:styleLbl name="trBgShp">
+    <dgm:fillClrLst meth="repeat">
+      <a:schemeClr val="accent1">
+        <a:tint val="50000"/>
+        <a:alpha val="40000"/>
+      </a:schemeClr>
+    </dgm:fillClrLst>
+    <dgm:linClrLst meth="repeat">
+      <a:schemeClr val="accent1"/>
+    </dgm:linClrLst>
+    <dgm:effectClrLst/>
+    <dgm:txLinClrLst/>
+    <dgm:txFillClrLst meth="repeat">
+      <a:schemeClr val="lt1"/>
+    </dgm:txFillClrLst>
+    <dgm:txEffectClrLst/>
+  </dgm:styleLbl>
+  <dgm:styleLbl name="fgShp">
+    <dgm:fillClrLst meth="repeat">
+      <a:schemeClr val="accent1">
+        <a:tint val="60000"/>
+      </a:schemeClr>
+    </dgm:fillClrLst>
+    <dgm:linClrLst meth="repeat">
+      <a:schemeClr val="lt1"/>
+    </dgm:linClrLst>
+    <dgm:effectClrLst/>
+    <dgm:txLinClrLst/>
+    <dgm:txFillClrLst meth="repeat">
+      <a:schemeClr val="dk1"/>
+    </dgm:txFillClrLst>
+    <dgm:txEffectClrLst/>
+  </dgm:styleLbl>
+  <dgm:styleLbl name="revTx">
+    <dgm:fillClrLst meth="repeat">
+      <a:schemeClr val="lt1">
+        <a:alpha val="0"/>
+      </a:schemeClr>
+    </dgm:fillClrLst>
+    <dgm:linClrLst meth="repeat">
+      <a:schemeClr val="dk1">
+        <a:alpha val="0"/>
+      </a:schemeClr>
+    </dgm:linClrLst>
+    <dgm:effectClrLst/>
+    <dgm:txLinClrLst/>
+    <dgm:txFillClrLst meth="repeat">
+      <a:schemeClr val="tx1"/>
+    </dgm:txFillClrLst>
+    <dgm:txEffectClrLst/>
+  </dgm:styleLbl>
+</dgm:colorsDef>
+</file>
+
+<file path=word/diagrams/data1.xml><?xml version="1.0" encoding="utf-8"?>
+<dgm:dataModel xmlns:dgm="http://schemas.openxmlformats.org/drawingml/2006/diagram" xmlns:a="http://schemas.openxmlformats.org/drawingml/2006/main">
+  <dgm:ptLst>
+    <dgm:pt modelId="{F8293AED-B9A4-4202-81FA-E8A807DD19E5}" type="doc">
+      <dgm:prSet loTypeId="urn:diagrams.loki3.com/BracketList" loCatId="list" qsTypeId="urn:microsoft.com/office/officeart/2005/8/quickstyle/simple1" qsCatId="simple" csTypeId="urn:microsoft.com/office/officeart/2005/8/colors/accent1_2" csCatId="accent1" phldr="1"/>
+      <dgm:spPr/>
+      <dgm:t>
+        <a:bodyPr/>
+        <a:lstStyle/>
+        <a:p>
+          <a:endParaRPr lang="en-CA"/>
+        </a:p>
+      </dgm:t>
+    </dgm:pt>
+    <dgm:pt modelId="{0B741B4A-BD07-4C2C-88C2-EF474C468A3A}">
+      <dgm:prSet phldrT="[Text]" custT="1"/>
+      <dgm:spPr/>
+      <dgm:t>
+        <a:bodyPr/>
+        <a:lstStyle/>
+        <a:p>
+          <a:r>
+            <a:rPr lang="en-CA" sz="1050"/>
+            <a:t>CTD2026.R</a:t>
+          </a:r>
+        </a:p>
+      </dgm:t>
+    </dgm:pt>
+    <dgm:pt modelId="{6F86CFE4-5A45-4647-BC2D-945C317F984C}" type="parTrans" cxnId="{DE4D09C1-715D-4579-A658-AE60EB46D1D7}">
+      <dgm:prSet/>
+      <dgm:spPr/>
+      <dgm:t>
+        <a:bodyPr/>
+        <a:lstStyle/>
+        <a:p>
+          <a:endParaRPr lang="en-CA" sz="1050"/>
+        </a:p>
+      </dgm:t>
+    </dgm:pt>
+    <dgm:pt modelId="{F5D05F61-71FB-4280-9431-0B24C2FA48B3}" type="sibTrans" cxnId="{DE4D09C1-715D-4579-A658-AE60EB46D1D7}">
+      <dgm:prSet/>
+      <dgm:spPr/>
+      <dgm:t>
+        <a:bodyPr/>
+        <a:lstStyle/>
+        <a:p>
+          <a:endParaRPr lang="en-CA" sz="1050"/>
+        </a:p>
+      </dgm:t>
+    </dgm:pt>
+    <dgm:pt modelId="{A759F03B-308B-4B19-98DA-959C9E057D5D}">
+      <dgm:prSet phldrT="[Text]" custT="1"/>
+      <dgm:spPr/>
+      <dgm:t>
+        <a:bodyPr/>
+        <a:lstStyle/>
+        <a:p>
+          <a:r>
+            <a:rPr lang="en-CA" sz="1050"/>
+            <a:t>creates dataframe complete with HSC CTD data and historic larval survey data collected within the Scots Bay and German Bank/Seal Island areas.</a:t>
+          </a:r>
+        </a:p>
+      </dgm:t>
+    </dgm:pt>
+    <dgm:pt modelId="{AC3F545A-24DD-4015-98F5-2C569612895E}" type="parTrans" cxnId="{7BB0193B-E260-4D59-8784-A50D26E40432}">
+      <dgm:prSet/>
+      <dgm:spPr/>
+      <dgm:t>
+        <a:bodyPr/>
+        <a:lstStyle/>
+        <a:p>
+          <a:endParaRPr lang="en-CA" sz="1050"/>
+        </a:p>
+      </dgm:t>
+    </dgm:pt>
+    <dgm:pt modelId="{1B445801-0A6D-4E7D-B42E-C52341080E8A}" type="sibTrans" cxnId="{7BB0193B-E260-4D59-8784-A50D26E40432}">
+      <dgm:prSet/>
+      <dgm:spPr/>
+      <dgm:t>
+        <a:bodyPr/>
+        <a:lstStyle/>
+        <a:p>
+          <a:endParaRPr lang="en-CA" sz="1050"/>
+        </a:p>
+      </dgm:t>
+    </dgm:pt>
+    <dgm:pt modelId="{F5A0A371-3868-44ED-8E50-1D5FF5F1E0AD}">
+      <dgm:prSet phldrT="[Text]" custT="1"/>
+      <dgm:spPr/>
+      <dgm:t>
+        <a:bodyPr/>
+        <a:lstStyle/>
+        <a:p>
+          <a:r>
+            <a:rPr lang="en-CA" sz="1050"/>
+            <a:t>.ncExtract.R</a:t>
+          </a:r>
+        </a:p>
+      </dgm:t>
+    </dgm:pt>
+    <dgm:pt modelId="{CF802B30-A559-44E9-A5E5-A101E853C272}" type="parTrans" cxnId="{0FE8D510-7F90-4B89-B08C-0DAF56012751}">
+      <dgm:prSet/>
+      <dgm:spPr/>
+      <dgm:t>
+        <a:bodyPr/>
+        <a:lstStyle/>
+        <a:p>
+          <a:endParaRPr lang="en-CA" sz="1050"/>
+        </a:p>
+      </dgm:t>
+    </dgm:pt>
+    <dgm:pt modelId="{88CD5AA5-C3F1-413C-A782-54FFC1FF6B57}" type="sibTrans" cxnId="{0FE8D510-7F90-4B89-B08C-0DAF56012751}">
+      <dgm:prSet/>
+      <dgm:spPr/>
+      <dgm:t>
+        <a:bodyPr/>
+        <a:lstStyle/>
+        <a:p>
+          <a:endParaRPr lang="en-CA" sz="1050"/>
+        </a:p>
+      </dgm:t>
+    </dgm:pt>
+    <dgm:pt modelId="{E9964C53-007A-4D05-93F8-E38C964A3A82}">
+      <dgm:prSet phldrT="[Text]" custT="1"/>
+      <dgm:spPr/>
+      <dgm:t>
+        <a:bodyPr/>
+        <a:lstStyle/>
+        <a:p>
+          <a:r>
+            <a:rPr lang="en-CA" sz="1050"/>
+            <a:t>brings in data from the CASTS site and creates a dataframe of CTD data that was either classified as the Prince 5 station, or other DFO data collections on the Scots Bay and German Bank/Seal Island area that can be combined with the HSC data to increase the sample size</a:t>
+          </a:r>
+        </a:p>
+      </dgm:t>
+    </dgm:pt>
+    <dgm:pt modelId="{979BE209-76AD-46C0-8CAE-820F033D4EEF}" type="parTrans" cxnId="{7D0BC3DD-35BA-46F3-A378-46805641548F}">
+      <dgm:prSet/>
+      <dgm:spPr/>
+      <dgm:t>
+        <a:bodyPr/>
+        <a:lstStyle/>
+        <a:p>
+          <a:endParaRPr lang="en-CA" sz="1050"/>
+        </a:p>
+      </dgm:t>
+    </dgm:pt>
+    <dgm:pt modelId="{273C1B75-5359-450A-A4A2-C9777925F0E1}" type="sibTrans" cxnId="{7D0BC3DD-35BA-46F3-A378-46805641548F}">
+      <dgm:prSet/>
+      <dgm:spPr/>
+      <dgm:t>
+        <a:bodyPr/>
+        <a:lstStyle/>
+        <a:p>
+          <a:endParaRPr lang="en-CA" sz="1050"/>
+        </a:p>
+      </dgm:t>
+    </dgm:pt>
+    <dgm:pt modelId="{64A7155B-956C-4413-A985-03F4EBA925E9}">
+      <dgm:prSet phldrT="[Text]" custT="1"/>
+      <dgm:spPr/>
+      <dgm:t>
+        <a:bodyPr/>
+        <a:lstStyle/>
+        <a:p>
+          <a:r>
+            <a:rPr lang="en-CA" sz="1050"/>
+            <a:t>rerdapp.R</a:t>
+          </a:r>
+        </a:p>
+      </dgm:t>
+    </dgm:pt>
+    <dgm:pt modelId="{AA3DD843-D107-4103-A9F5-6D2B7627CD2C}" type="parTrans" cxnId="{E034D399-7E08-49D4-B0D7-80FA41EEEAB8}">
+      <dgm:prSet/>
+      <dgm:spPr/>
+      <dgm:t>
+        <a:bodyPr/>
+        <a:lstStyle/>
+        <a:p>
+          <a:endParaRPr lang="en-CA" sz="1050"/>
+        </a:p>
+      </dgm:t>
+    </dgm:pt>
+    <dgm:pt modelId="{C6E11703-7278-45D0-805F-0A9441A2BF75}" type="sibTrans" cxnId="{E034D399-7E08-49D4-B0D7-80FA41EEEAB8}">
+      <dgm:prSet/>
+      <dgm:spPr/>
+      <dgm:t>
+        <a:bodyPr/>
+        <a:lstStyle/>
+        <a:p>
+          <a:endParaRPr lang="en-CA" sz="1050"/>
+        </a:p>
+      </dgm:t>
+    </dgm:pt>
+    <dgm:pt modelId="{6C648368-6261-45FF-A5C9-58BB9117215C}">
+      <dgm:prSet phldrT="[Text]" custT="1"/>
+      <dgm:spPr/>
+      <dgm:t>
+        <a:bodyPr/>
+        <a:lstStyle/>
+        <a:p>
+          <a:r>
+            <a:rPr lang="en-CA" sz="1050"/>
+            <a:t>Downloads the 2024 Prince 5 data from the CIOOS site and </a:t>
+          </a:r>
+          <a:r>
+            <a:rPr lang="en-CA" sz="1050" b="0" i="0"/>
+            <a:t>Maritimes Region Atlantic Zone Monitoring Program (AZMP) Rosette Vertical Profiles dataset</a:t>
+          </a:r>
+          <a:endParaRPr lang="en-CA" sz="1050"/>
+        </a:p>
+      </dgm:t>
+    </dgm:pt>
+    <dgm:pt modelId="{B54B44ED-7D93-4C4E-B854-CAA1484D4A0E}" type="parTrans" cxnId="{87D98606-9908-4F1A-AD2D-9E404AC4962B}">
+      <dgm:prSet/>
+      <dgm:spPr/>
+      <dgm:t>
+        <a:bodyPr/>
+        <a:lstStyle/>
+        <a:p>
+          <a:endParaRPr lang="en-CA" sz="1050"/>
+        </a:p>
+      </dgm:t>
+    </dgm:pt>
+    <dgm:pt modelId="{3CD8D468-CFE9-4811-A023-BD9B78E63EB1}" type="sibTrans" cxnId="{87D98606-9908-4F1A-AD2D-9E404AC4962B}">
+      <dgm:prSet/>
+      <dgm:spPr/>
+      <dgm:t>
+        <a:bodyPr/>
+        <a:lstStyle/>
+        <a:p>
+          <a:endParaRPr lang="en-CA" sz="1050"/>
+        </a:p>
+      </dgm:t>
+    </dgm:pt>
+    <dgm:pt modelId="{E61A77B8-66EE-4C73-99AB-CA85AC13807C}">
+      <dgm:prSet phldrT="[Text]" custT="1"/>
+      <dgm:spPr/>
+      <dgm:t>
+        <a:bodyPr/>
+        <a:lstStyle/>
+        <a:p>
+          <a:r>
+            <a:rPr lang="en-CA" sz="1050" i="1"/>
+            <a:t>Need to figure out how to get this dataset in the same form as above (gives a downwards and upwards cast rather than just one as when using CASTS)</a:t>
+          </a:r>
+        </a:p>
+      </dgm:t>
+    </dgm:pt>
+    <dgm:pt modelId="{2197A981-3CC0-4887-81F5-1B3B2618137D}" type="parTrans" cxnId="{78AB24BD-6742-4123-A479-85CE63B131BD}">
+      <dgm:prSet/>
+      <dgm:spPr/>
+      <dgm:t>
+        <a:bodyPr/>
+        <a:lstStyle/>
+        <a:p>
+          <a:endParaRPr lang="en-CA" sz="1050"/>
+        </a:p>
+      </dgm:t>
+    </dgm:pt>
+    <dgm:pt modelId="{424374F8-0274-4E54-9183-49A3B6455F16}" type="sibTrans" cxnId="{78AB24BD-6742-4123-A479-85CE63B131BD}">
+      <dgm:prSet/>
+      <dgm:spPr/>
+      <dgm:t>
+        <a:bodyPr/>
+        <a:lstStyle/>
+        <a:p>
+          <a:endParaRPr lang="en-CA" sz="1050"/>
+        </a:p>
+      </dgm:t>
+    </dgm:pt>
+    <dgm:pt modelId="{B9ED0B48-948D-421B-83A1-6709A1C161D4}">
+      <dgm:prSet phldrT="[Text]" custT="1"/>
+      <dgm:spPr/>
+      <dgm:t>
+        <a:bodyPr/>
+        <a:lstStyle/>
+        <a:p>
+          <a:r>
+            <a:rPr lang="en-CA" sz="1050"/>
+            <a:t>For Prince 5 this includes data from 2017 to 2023</a:t>
+          </a:r>
+        </a:p>
+      </dgm:t>
+    </dgm:pt>
+    <dgm:pt modelId="{7C73FDCD-9676-49EE-BDC5-72A49A315A45}" type="parTrans" cxnId="{5399BE64-206A-4F5B-9C64-71FCE287D3B0}">
+      <dgm:prSet/>
+      <dgm:spPr/>
+    </dgm:pt>
+    <dgm:pt modelId="{E02078BF-3D83-41C9-A360-D4A31433AD71}" type="sibTrans" cxnId="{5399BE64-206A-4F5B-9C64-71FCE287D3B0}">
+      <dgm:prSet/>
+      <dgm:spPr/>
+    </dgm:pt>
+    <dgm:pt modelId="{545C2918-73EE-4BFD-AD5F-E11BE7BD0CC0}" type="pres">
+      <dgm:prSet presAssocID="{F8293AED-B9A4-4202-81FA-E8A807DD19E5}" presName="Name0" presStyleCnt="0">
+        <dgm:presLayoutVars>
+          <dgm:dir/>
+          <dgm:animLvl val="lvl"/>
+          <dgm:resizeHandles val="exact"/>
+        </dgm:presLayoutVars>
+      </dgm:prSet>
+      <dgm:spPr/>
+    </dgm:pt>
+    <dgm:pt modelId="{115AB0B8-144B-413B-9B96-D1A796317916}" type="pres">
+      <dgm:prSet presAssocID="{0B741B4A-BD07-4C2C-88C2-EF474C468A3A}" presName="linNode" presStyleCnt="0"/>
+      <dgm:spPr/>
+    </dgm:pt>
+    <dgm:pt modelId="{06787B96-D107-4B50-BB4C-512E71CC2EA5}" type="pres">
+      <dgm:prSet presAssocID="{0B741B4A-BD07-4C2C-88C2-EF474C468A3A}" presName="parTx" presStyleLbl="revTx" presStyleIdx="0" presStyleCnt="3">
+        <dgm:presLayoutVars>
+          <dgm:chMax val="1"/>
+          <dgm:bulletEnabled val="1"/>
+        </dgm:presLayoutVars>
+      </dgm:prSet>
+      <dgm:spPr/>
+    </dgm:pt>
+    <dgm:pt modelId="{79D22151-365E-4F04-A9C0-B2862C0DBC9D}" type="pres">
+      <dgm:prSet presAssocID="{0B741B4A-BD07-4C2C-88C2-EF474C468A3A}" presName="bracket" presStyleLbl="parChTrans1D1" presStyleIdx="0" presStyleCnt="3"/>
+      <dgm:spPr/>
+    </dgm:pt>
+    <dgm:pt modelId="{178775C5-D22E-4AAE-883E-511F86C0B9FF}" type="pres">
+      <dgm:prSet presAssocID="{0B741B4A-BD07-4C2C-88C2-EF474C468A3A}" presName="spH" presStyleCnt="0"/>
+      <dgm:spPr/>
+    </dgm:pt>
+    <dgm:pt modelId="{D1952F0C-E215-4394-8424-72C2AA7CC6E2}" type="pres">
+      <dgm:prSet presAssocID="{0B741B4A-BD07-4C2C-88C2-EF474C468A3A}" presName="desTx" presStyleLbl="node1" presStyleIdx="0" presStyleCnt="3">
+        <dgm:presLayoutVars>
+          <dgm:bulletEnabled val="1"/>
+        </dgm:presLayoutVars>
+      </dgm:prSet>
+      <dgm:spPr/>
+    </dgm:pt>
+    <dgm:pt modelId="{0A6E0E9D-6638-4FF9-90EE-ACC3DD6C0511}" type="pres">
+      <dgm:prSet presAssocID="{F5D05F61-71FB-4280-9431-0B24C2FA48B3}" presName="spV" presStyleCnt="0"/>
+      <dgm:spPr/>
+    </dgm:pt>
+    <dgm:pt modelId="{82893103-8D06-4F43-A037-05DB90A479EE}" type="pres">
+      <dgm:prSet presAssocID="{F5A0A371-3868-44ED-8E50-1D5FF5F1E0AD}" presName="linNode" presStyleCnt="0"/>
+      <dgm:spPr/>
+    </dgm:pt>
+    <dgm:pt modelId="{B5E3E2AF-A572-43D0-8C15-207B79A92662}" type="pres">
+      <dgm:prSet presAssocID="{F5A0A371-3868-44ED-8E50-1D5FF5F1E0AD}" presName="parTx" presStyleLbl="revTx" presStyleIdx="1" presStyleCnt="3">
+        <dgm:presLayoutVars>
+          <dgm:chMax val="1"/>
+          <dgm:bulletEnabled val="1"/>
+        </dgm:presLayoutVars>
+      </dgm:prSet>
+      <dgm:spPr/>
+    </dgm:pt>
+    <dgm:pt modelId="{4FF43A53-3DA8-4CFC-A402-E663CF2F04C3}" type="pres">
+      <dgm:prSet presAssocID="{F5A0A371-3868-44ED-8E50-1D5FF5F1E0AD}" presName="bracket" presStyleLbl="parChTrans1D1" presStyleIdx="1" presStyleCnt="3"/>
+      <dgm:spPr/>
+    </dgm:pt>
+    <dgm:pt modelId="{54D59365-40D9-4A8F-93F7-A4C53298F691}" type="pres">
+      <dgm:prSet presAssocID="{F5A0A371-3868-44ED-8E50-1D5FF5F1E0AD}" presName="spH" presStyleCnt="0"/>
+      <dgm:spPr/>
+    </dgm:pt>
+    <dgm:pt modelId="{B8A45921-2C5B-4464-841D-5D5AEF216018}" type="pres">
+      <dgm:prSet presAssocID="{F5A0A371-3868-44ED-8E50-1D5FF5F1E0AD}" presName="desTx" presStyleLbl="node1" presStyleIdx="1" presStyleCnt="3">
+        <dgm:presLayoutVars>
+          <dgm:bulletEnabled val="1"/>
+        </dgm:presLayoutVars>
+      </dgm:prSet>
+      <dgm:spPr/>
+    </dgm:pt>
+    <dgm:pt modelId="{3DE07A94-1859-4A36-AE35-F84A33D352A9}" type="pres">
+      <dgm:prSet presAssocID="{88CD5AA5-C3F1-413C-A782-54FFC1FF6B57}" presName="spV" presStyleCnt="0"/>
+      <dgm:spPr/>
+    </dgm:pt>
+    <dgm:pt modelId="{D4AD5C5B-C228-47E2-BAC4-AE37E8BEB5DE}" type="pres">
+      <dgm:prSet presAssocID="{64A7155B-956C-4413-A985-03F4EBA925E9}" presName="linNode" presStyleCnt="0"/>
+      <dgm:spPr/>
+    </dgm:pt>
+    <dgm:pt modelId="{8BB60D3E-FB86-4F6F-B1D8-C44BAAB50A38}" type="pres">
+      <dgm:prSet presAssocID="{64A7155B-956C-4413-A985-03F4EBA925E9}" presName="parTx" presStyleLbl="revTx" presStyleIdx="2" presStyleCnt="3">
+        <dgm:presLayoutVars>
+          <dgm:chMax val="1"/>
+          <dgm:bulletEnabled val="1"/>
+        </dgm:presLayoutVars>
+      </dgm:prSet>
+      <dgm:spPr/>
+    </dgm:pt>
+    <dgm:pt modelId="{14F98FF1-4158-4210-8D48-AACF65D1D83A}" type="pres">
+      <dgm:prSet presAssocID="{64A7155B-956C-4413-A985-03F4EBA925E9}" presName="bracket" presStyleLbl="parChTrans1D1" presStyleIdx="2" presStyleCnt="3"/>
+      <dgm:spPr/>
+    </dgm:pt>
+    <dgm:pt modelId="{6EA7469A-D461-4D52-B600-50169920DC2D}" type="pres">
+      <dgm:prSet presAssocID="{64A7155B-956C-4413-A985-03F4EBA925E9}" presName="spH" presStyleCnt="0"/>
+      <dgm:spPr/>
+    </dgm:pt>
+    <dgm:pt modelId="{8E5DF453-1A2E-445C-9157-A7FD19744361}" type="pres">
+      <dgm:prSet presAssocID="{64A7155B-956C-4413-A985-03F4EBA925E9}" presName="desTx" presStyleLbl="node1" presStyleIdx="2" presStyleCnt="3">
+        <dgm:presLayoutVars>
+          <dgm:bulletEnabled val="1"/>
+        </dgm:presLayoutVars>
+      </dgm:prSet>
+      <dgm:spPr/>
+    </dgm:pt>
+  </dgm:ptLst>
+  <dgm:cxnLst>
+    <dgm:cxn modelId="{87D98606-9908-4F1A-AD2D-9E404AC4962B}" srcId="{64A7155B-956C-4413-A985-03F4EBA925E9}" destId="{6C648368-6261-45FF-A5C9-58BB9117215C}" srcOrd="0" destOrd="0" parTransId="{B54B44ED-7D93-4C4E-B854-CAA1484D4A0E}" sibTransId="{3CD8D468-CFE9-4811-A023-BD9B78E63EB1}"/>
+    <dgm:cxn modelId="{0FE8D510-7F90-4B89-B08C-0DAF56012751}" srcId="{F8293AED-B9A4-4202-81FA-E8A807DD19E5}" destId="{F5A0A371-3868-44ED-8E50-1D5FF5F1E0AD}" srcOrd="1" destOrd="0" parTransId="{CF802B30-A559-44E9-A5E5-A101E853C272}" sibTransId="{88CD5AA5-C3F1-413C-A782-54FFC1FF6B57}"/>
+    <dgm:cxn modelId="{E6818413-D172-4110-A939-A54A230015CD}" type="presOf" srcId="{64A7155B-956C-4413-A985-03F4EBA925E9}" destId="{8BB60D3E-FB86-4F6F-B1D8-C44BAAB50A38}" srcOrd="0" destOrd="0" presId="urn:diagrams.loki3.com/BracketList"/>
+    <dgm:cxn modelId="{7BB0193B-E260-4D59-8784-A50D26E40432}" srcId="{0B741B4A-BD07-4C2C-88C2-EF474C468A3A}" destId="{A759F03B-308B-4B19-98DA-959C9E057D5D}" srcOrd="0" destOrd="0" parTransId="{AC3F545A-24DD-4015-98F5-2C569612895E}" sibTransId="{1B445801-0A6D-4E7D-B42E-C52341080E8A}"/>
+    <dgm:cxn modelId="{C220B95B-21EB-4CBE-857C-3EB58BC3B393}" type="presOf" srcId="{A759F03B-308B-4B19-98DA-959C9E057D5D}" destId="{D1952F0C-E215-4394-8424-72C2AA7CC6E2}" srcOrd="0" destOrd="0" presId="urn:diagrams.loki3.com/BracketList"/>
+    <dgm:cxn modelId="{A834FD42-EA67-4E17-BA48-9F098FF16507}" type="presOf" srcId="{E9964C53-007A-4D05-93F8-E38C964A3A82}" destId="{B8A45921-2C5B-4464-841D-5D5AEF216018}" srcOrd="0" destOrd="0" presId="urn:diagrams.loki3.com/BracketList"/>
+    <dgm:cxn modelId="{42C63643-17EA-41E2-B996-DB105CEECDD9}" type="presOf" srcId="{F5A0A371-3868-44ED-8E50-1D5FF5F1E0AD}" destId="{B5E3E2AF-A572-43D0-8C15-207B79A92662}" srcOrd="0" destOrd="0" presId="urn:diagrams.loki3.com/BracketList"/>
+    <dgm:cxn modelId="{1C3A5B43-9AEB-4ED3-927E-F4F74886DDB8}" type="presOf" srcId="{6C648368-6261-45FF-A5C9-58BB9117215C}" destId="{8E5DF453-1A2E-445C-9157-A7FD19744361}" srcOrd="0" destOrd="0" presId="urn:diagrams.loki3.com/BracketList"/>
+    <dgm:cxn modelId="{5399BE64-206A-4F5B-9C64-71FCE287D3B0}" srcId="{F5A0A371-3868-44ED-8E50-1D5FF5F1E0AD}" destId="{B9ED0B48-948D-421B-83A1-6709A1C161D4}" srcOrd="1" destOrd="0" parTransId="{7C73FDCD-9676-49EE-BDC5-72A49A315A45}" sibTransId="{E02078BF-3D83-41C9-A360-D4A31433AD71}"/>
+    <dgm:cxn modelId="{CF193355-6888-4B01-ABC0-84C5AA4C7957}" type="presOf" srcId="{0B741B4A-BD07-4C2C-88C2-EF474C468A3A}" destId="{06787B96-D107-4B50-BB4C-512E71CC2EA5}" srcOrd="0" destOrd="0" presId="urn:diagrams.loki3.com/BracketList"/>
+    <dgm:cxn modelId="{C2C3D785-7533-4AFC-977F-519B77419EB8}" type="presOf" srcId="{E61A77B8-66EE-4C73-99AB-CA85AC13807C}" destId="{8E5DF453-1A2E-445C-9157-A7FD19744361}" srcOrd="0" destOrd="1" presId="urn:diagrams.loki3.com/BracketList"/>
+    <dgm:cxn modelId="{E034D399-7E08-49D4-B0D7-80FA41EEEAB8}" srcId="{F8293AED-B9A4-4202-81FA-E8A807DD19E5}" destId="{64A7155B-956C-4413-A985-03F4EBA925E9}" srcOrd="2" destOrd="0" parTransId="{AA3DD843-D107-4103-A9F5-6D2B7627CD2C}" sibTransId="{C6E11703-7278-45D0-805F-0A9441A2BF75}"/>
+    <dgm:cxn modelId="{78AB24BD-6742-4123-A479-85CE63B131BD}" srcId="{64A7155B-956C-4413-A985-03F4EBA925E9}" destId="{E61A77B8-66EE-4C73-99AB-CA85AC13807C}" srcOrd="1" destOrd="0" parTransId="{2197A981-3CC0-4887-81F5-1B3B2618137D}" sibTransId="{424374F8-0274-4E54-9183-49A3B6455F16}"/>
+    <dgm:cxn modelId="{DE4D09C1-715D-4579-A658-AE60EB46D1D7}" srcId="{F8293AED-B9A4-4202-81FA-E8A807DD19E5}" destId="{0B741B4A-BD07-4C2C-88C2-EF474C468A3A}" srcOrd="0" destOrd="0" parTransId="{6F86CFE4-5A45-4647-BC2D-945C317F984C}" sibTransId="{F5D05F61-71FB-4280-9431-0B24C2FA48B3}"/>
+    <dgm:cxn modelId="{0F4AAFD7-D65C-4FCA-B5B6-C81B56425F2A}" type="presOf" srcId="{F8293AED-B9A4-4202-81FA-E8A807DD19E5}" destId="{545C2918-73EE-4BFD-AD5F-E11BE7BD0CC0}" srcOrd="0" destOrd="0" presId="urn:diagrams.loki3.com/BracketList"/>
+    <dgm:cxn modelId="{95FF00DD-6060-4981-B2BB-1AAA51B7BEFE}" type="presOf" srcId="{B9ED0B48-948D-421B-83A1-6709A1C161D4}" destId="{B8A45921-2C5B-4464-841D-5D5AEF216018}" srcOrd="0" destOrd="1" presId="urn:diagrams.loki3.com/BracketList"/>
+    <dgm:cxn modelId="{7D0BC3DD-35BA-46F3-A378-46805641548F}" srcId="{F5A0A371-3868-44ED-8E50-1D5FF5F1E0AD}" destId="{E9964C53-007A-4D05-93F8-E38C964A3A82}" srcOrd="0" destOrd="0" parTransId="{979BE209-76AD-46C0-8CAE-820F033D4EEF}" sibTransId="{273C1B75-5359-450A-A4A2-C9777925F0E1}"/>
+    <dgm:cxn modelId="{A4B0C764-A8AB-48F9-95FF-769FF31EF459}" type="presParOf" srcId="{545C2918-73EE-4BFD-AD5F-E11BE7BD0CC0}" destId="{115AB0B8-144B-413B-9B96-D1A796317916}" srcOrd="0" destOrd="0" presId="urn:diagrams.loki3.com/BracketList"/>
+    <dgm:cxn modelId="{DF034D59-D62A-4CE9-9EF9-99D98DC70CD8}" type="presParOf" srcId="{115AB0B8-144B-413B-9B96-D1A796317916}" destId="{06787B96-D107-4B50-BB4C-512E71CC2EA5}" srcOrd="0" destOrd="0" presId="urn:diagrams.loki3.com/BracketList"/>
+    <dgm:cxn modelId="{81A3E789-C04D-4143-812F-35A1E2E38B29}" type="presParOf" srcId="{115AB0B8-144B-413B-9B96-D1A796317916}" destId="{79D22151-365E-4F04-A9C0-B2862C0DBC9D}" srcOrd="1" destOrd="0" presId="urn:diagrams.loki3.com/BracketList"/>
+    <dgm:cxn modelId="{89559D46-535F-4650-96C3-B3B7FDF1812C}" type="presParOf" srcId="{115AB0B8-144B-413B-9B96-D1A796317916}" destId="{178775C5-D22E-4AAE-883E-511F86C0B9FF}" srcOrd="2" destOrd="0" presId="urn:diagrams.loki3.com/BracketList"/>
+    <dgm:cxn modelId="{438BC36F-30C6-4D91-B496-D8505FB971E8}" type="presParOf" srcId="{115AB0B8-144B-413B-9B96-D1A796317916}" destId="{D1952F0C-E215-4394-8424-72C2AA7CC6E2}" srcOrd="3" destOrd="0" presId="urn:diagrams.loki3.com/BracketList"/>
+    <dgm:cxn modelId="{E63B1DAC-8078-428F-AF4D-49CB0A873D82}" type="presParOf" srcId="{545C2918-73EE-4BFD-AD5F-E11BE7BD0CC0}" destId="{0A6E0E9D-6638-4FF9-90EE-ACC3DD6C0511}" srcOrd="1" destOrd="0" presId="urn:diagrams.loki3.com/BracketList"/>
+    <dgm:cxn modelId="{207D5CBF-B491-44FD-B661-53978856D9C6}" type="presParOf" srcId="{545C2918-73EE-4BFD-AD5F-E11BE7BD0CC0}" destId="{82893103-8D06-4F43-A037-05DB90A479EE}" srcOrd="2" destOrd="0" presId="urn:diagrams.loki3.com/BracketList"/>
+    <dgm:cxn modelId="{32CA43AC-8AD6-4591-904A-0175E916A36C}" type="presParOf" srcId="{82893103-8D06-4F43-A037-05DB90A479EE}" destId="{B5E3E2AF-A572-43D0-8C15-207B79A92662}" srcOrd="0" destOrd="0" presId="urn:diagrams.loki3.com/BracketList"/>
+    <dgm:cxn modelId="{ECD8A639-C7F8-42AE-AE40-294A5750AA95}" type="presParOf" srcId="{82893103-8D06-4F43-A037-05DB90A479EE}" destId="{4FF43A53-3DA8-4CFC-A402-E663CF2F04C3}" srcOrd="1" destOrd="0" presId="urn:diagrams.loki3.com/BracketList"/>
+    <dgm:cxn modelId="{C08A7439-4906-4B91-B290-6AF395575BFA}" type="presParOf" srcId="{82893103-8D06-4F43-A037-05DB90A479EE}" destId="{54D59365-40D9-4A8F-93F7-A4C53298F691}" srcOrd="2" destOrd="0" presId="urn:diagrams.loki3.com/BracketList"/>
+    <dgm:cxn modelId="{19244B7E-6027-4AC8-9C5D-21A7593E8071}" type="presParOf" srcId="{82893103-8D06-4F43-A037-05DB90A479EE}" destId="{B8A45921-2C5B-4464-841D-5D5AEF216018}" srcOrd="3" destOrd="0" presId="urn:diagrams.loki3.com/BracketList"/>
+    <dgm:cxn modelId="{B7519032-83FF-4960-8EE7-4F6882909455}" type="presParOf" srcId="{545C2918-73EE-4BFD-AD5F-E11BE7BD0CC0}" destId="{3DE07A94-1859-4A36-AE35-F84A33D352A9}" srcOrd="3" destOrd="0" presId="urn:diagrams.loki3.com/BracketList"/>
+    <dgm:cxn modelId="{B8A4B694-FD61-4ABB-9937-9727A1833C8C}" type="presParOf" srcId="{545C2918-73EE-4BFD-AD5F-E11BE7BD0CC0}" destId="{D4AD5C5B-C228-47E2-BAC4-AE37E8BEB5DE}" srcOrd="4" destOrd="0" presId="urn:diagrams.loki3.com/BracketList"/>
+    <dgm:cxn modelId="{A2A213C5-E309-41CF-A35B-6477D4283E28}" type="presParOf" srcId="{D4AD5C5B-C228-47E2-BAC4-AE37E8BEB5DE}" destId="{8BB60D3E-FB86-4F6F-B1D8-C44BAAB50A38}" srcOrd="0" destOrd="0" presId="urn:diagrams.loki3.com/BracketList"/>
+    <dgm:cxn modelId="{EB3CEAB3-25AF-4630-8509-D23835332D2A}" type="presParOf" srcId="{D4AD5C5B-C228-47E2-BAC4-AE37E8BEB5DE}" destId="{14F98FF1-4158-4210-8D48-AACF65D1D83A}" srcOrd="1" destOrd="0" presId="urn:diagrams.loki3.com/BracketList"/>
+    <dgm:cxn modelId="{D02A39B0-4E97-4E8F-BB4E-CC515AD9343C}" type="presParOf" srcId="{D4AD5C5B-C228-47E2-BAC4-AE37E8BEB5DE}" destId="{6EA7469A-D461-4D52-B600-50169920DC2D}" srcOrd="2" destOrd="0" presId="urn:diagrams.loki3.com/BracketList"/>
+    <dgm:cxn modelId="{46C9AF68-01BC-4E67-A44E-D4FA9EFEA0D1}" type="presParOf" srcId="{D4AD5C5B-C228-47E2-BAC4-AE37E8BEB5DE}" destId="{8E5DF453-1A2E-445C-9157-A7FD19744361}" srcOrd="3" destOrd="0" presId="urn:diagrams.loki3.com/BracketList"/>
+  </dgm:cxnLst>
+  <dgm:bg/>
+  <dgm:whole/>
+  <dgm:extLst>
+    <a:ext uri="http://schemas.microsoft.com/office/drawing/2008/diagram">
+      <dsp:dataModelExt xmlns:dsp="http://schemas.microsoft.com/office/drawing/2008/diagram" relId="rId20" minVer="http://schemas.openxmlformats.org/drawingml/2006/diagram"/>
+    </a:ext>
+  </dgm:extLst>
+</dgm:dataModel>
+</file>
+
+<file path=word/diagrams/drawing1.xml><?xml version="1.0" encoding="utf-8"?>
+<dsp:drawing xmlns:dgm="http://schemas.openxmlformats.org/drawingml/2006/diagram" xmlns:dsp="http://schemas.microsoft.com/office/drawing/2008/diagram" xmlns:a="http://schemas.openxmlformats.org/drawingml/2006/main">
+  <dsp:spTree>
+    <dsp:nvGrpSpPr>
+      <dsp:cNvPr id="0" name=""/>
+      <dsp:cNvGrpSpPr/>
+    </dsp:nvGrpSpPr>
+    <dsp:grpSpPr/>
+    <dsp:sp modelId="{06787B96-D107-4B50-BB4C-512E71CC2EA5}">
+      <dsp:nvSpPr>
+        <dsp:cNvPr id="0" name=""/>
+        <dsp:cNvSpPr/>
+      </dsp:nvSpPr>
+      <dsp:spPr>
+        <a:xfrm>
+          <a:off x="0" y="8662"/>
+          <a:ext cx="1371600" cy="851400"/>
+        </a:xfrm>
+        <a:prstGeom prst="rect">
+          <a:avLst/>
+        </a:prstGeom>
+        <a:noFill/>
+        <a:ln>
+          <a:noFill/>
+        </a:ln>
+        <a:effectLst/>
+      </dsp:spPr>
+      <dsp:style>
+        <a:lnRef idx="0">
+          <a:scrgbClr r="0" g="0" b="0"/>
+        </a:lnRef>
+        <a:fillRef idx="0">
+          <a:scrgbClr r="0" g="0" b="0"/>
+        </a:fillRef>
+        <a:effectRef idx="0">
+          <a:scrgbClr r="0" g="0" b="0"/>
+        </a:effectRef>
+        <a:fontRef idx="minor"/>
+      </dsp:style>
+      <dsp:txBody>
+        <a:bodyPr spcFirstLastPara="0" vert="horz" wrap="square" lIns="78232" tIns="27940" rIns="78232" bIns="27940" numCol="1" spcCol="1270" anchor="ctr" anchorCtr="0">
+          <a:noAutofit/>
+        </a:bodyPr>
+        <a:lstStyle/>
+        <a:p>
+          <a:pPr marL="0" lvl="0" indent="0" algn="r" defTabSz="466725">
+            <a:lnSpc>
+              <a:spcPct val="90000"/>
+            </a:lnSpc>
+            <a:spcBef>
+              <a:spcPct val="0"/>
+            </a:spcBef>
+            <a:spcAft>
+              <a:spcPct val="35000"/>
+            </a:spcAft>
+            <a:buNone/>
+          </a:pPr>
+          <a:r>
+            <a:rPr lang="en-CA" sz="1050" kern="1200"/>
+            <a:t>CTD2026.R</a:t>
+          </a:r>
+        </a:p>
+      </dsp:txBody>
+      <dsp:txXfrm>
+        <a:off x="0" y="8662"/>
+        <a:ext cx="1371600" cy="851400"/>
+      </dsp:txXfrm>
+    </dsp:sp>
+    <dsp:sp modelId="{79D22151-365E-4F04-A9C0-B2862C0DBC9D}">
+      <dsp:nvSpPr>
+        <dsp:cNvPr id="0" name=""/>
+        <dsp:cNvSpPr/>
+      </dsp:nvSpPr>
+      <dsp:spPr>
+        <a:xfrm>
+          <a:off x="1371599" y="8662"/>
+          <a:ext cx="274320" cy="851400"/>
+        </a:xfrm>
+        <a:prstGeom prst="leftBrace">
+          <a:avLst>
+            <a:gd name="adj1" fmla="val 35000"/>
+            <a:gd name="adj2" fmla="val 50000"/>
+          </a:avLst>
+        </a:prstGeom>
+        <a:noFill/>
+        <a:ln w="19050" cap="flat" cmpd="sng" algn="ctr">
+          <a:solidFill>
+            <a:schemeClr val="accent1">
+              <a:shade val="60000"/>
+              <a:hueOff val="0"/>
+              <a:satOff val="0"/>
+              <a:lumOff val="0"/>
+              <a:alphaOff val="0"/>
+            </a:schemeClr>
+          </a:solidFill>
+          <a:prstDash val="solid"/>
+          <a:miter lim="800000"/>
+        </a:ln>
+        <a:effectLst/>
+      </dsp:spPr>
+      <dsp:style>
+        <a:lnRef idx="2">
+          <a:scrgbClr r="0" g="0" b="0"/>
+        </a:lnRef>
+        <a:fillRef idx="0">
+          <a:scrgbClr r="0" g="0" b="0"/>
+        </a:fillRef>
+        <a:effectRef idx="0">
+          <a:scrgbClr r="0" g="0" b="0"/>
+        </a:effectRef>
+        <a:fontRef idx="minor"/>
+      </dsp:style>
+    </dsp:sp>
+    <dsp:sp modelId="{D1952F0C-E215-4394-8424-72C2AA7CC6E2}">
+      <dsp:nvSpPr>
+        <dsp:cNvPr id="0" name=""/>
+        <dsp:cNvSpPr/>
+      </dsp:nvSpPr>
+      <dsp:spPr>
+        <a:xfrm>
+          <a:off x="1755647" y="8662"/>
+          <a:ext cx="3730752" cy="851400"/>
+        </a:xfrm>
+        <a:prstGeom prst="rect">
+          <a:avLst/>
+        </a:prstGeom>
+        <a:solidFill>
+          <a:schemeClr val="accent1">
+            <a:hueOff val="0"/>
+            <a:satOff val="0"/>
+            <a:lumOff val="0"/>
+            <a:alphaOff val="0"/>
+          </a:schemeClr>
+        </a:solidFill>
+        <a:ln w="19050" cap="flat" cmpd="sng" algn="ctr">
+          <a:solidFill>
+            <a:schemeClr val="lt1">
+              <a:hueOff val="0"/>
+              <a:satOff val="0"/>
+              <a:lumOff val="0"/>
+              <a:alphaOff val="0"/>
+            </a:schemeClr>
+          </a:solidFill>
+          <a:prstDash val="solid"/>
+          <a:miter lim="800000"/>
+        </a:ln>
+        <a:effectLst/>
+      </dsp:spPr>
+      <dsp:style>
+        <a:lnRef idx="2">
+          <a:scrgbClr r="0" g="0" b="0"/>
+        </a:lnRef>
+        <a:fillRef idx="1">
+          <a:scrgbClr r="0" g="0" b="0"/>
+        </a:fillRef>
+        <a:effectRef idx="0">
+          <a:scrgbClr r="0" g="0" b="0"/>
+        </a:effectRef>
+        <a:fontRef idx="minor">
+          <a:schemeClr val="lt1"/>
+        </a:fontRef>
+      </dsp:style>
+      <dsp:txBody>
+        <a:bodyPr spcFirstLastPara="0" vert="horz" wrap="square" lIns="41910" tIns="41910" rIns="41910" bIns="41910" numCol="1" spcCol="1270" anchor="ctr" anchorCtr="0">
+          <a:noAutofit/>
+        </a:bodyPr>
+        <a:lstStyle/>
+        <a:p>
+          <a:pPr marL="57150" lvl="1" indent="-57150" algn="l" defTabSz="466725">
+            <a:lnSpc>
+              <a:spcPct val="90000"/>
+            </a:lnSpc>
+            <a:spcBef>
+              <a:spcPct val="0"/>
+            </a:spcBef>
+            <a:spcAft>
+              <a:spcPct val="15000"/>
+            </a:spcAft>
+            <a:buChar char="•"/>
+          </a:pPr>
+          <a:r>
+            <a:rPr lang="en-CA" sz="1050" kern="1200"/>
+            <a:t>creates dataframe complete with HSC CTD data and historic larval survey data collected within the Scots Bay and German Bank/Seal Island areas.</a:t>
+          </a:r>
+        </a:p>
+      </dsp:txBody>
+      <dsp:txXfrm>
+        <a:off x="1755647" y="8662"/>
+        <a:ext cx="3730752" cy="851400"/>
+      </dsp:txXfrm>
+    </dsp:sp>
+    <dsp:sp modelId="{B5E3E2AF-A572-43D0-8C15-207B79A92662}">
+      <dsp:nvSpPr>
+        <dsp:cNvPr id="0" name=""/>
+        <dsp:cNvSpPr/>
+      </dsp:nvSpPr>
+      <dsp:spPr>
+        <a:xfrm>
+          <a:off x="0" y="1094681"/>
+          <a:ext cx="1371600" cy="851400"/>
+        </a:xfrm>
+        <a:prstGeom prst="rect">
+          <a:avLst/>
+        </a:prstGeom>
+        <a:noFill/>
+        <a:ln>
+          <a:noFill/>
+        </a:ln>
+        <a:effectLst/>
+      </dsp:spPr>
+      <dsp:style>
+        <a:lnRef idx="0">
+          <a:scrgbClr r="0" g="0" b="0"/>
+        </a:lnRef>
+        <a:fillRef idx="0">
+          <a:scrgbClr r="0" g="0" b="0"/>
+        </a:fillRef>
+        <a:effectRef idx="0">
+          <a:scrgbClr r="0" g="0" b="0"/>
+        </a:effectRef>
+        <a:fontRef idx="minor"/>
+      </dsp:style>
+      <dsp:txBody>
+        <a:bodyPr spcFirstLastPara="0" vert="horz" wrap="square" lIns="78232" tIns="27940" rIns="78232" bIns="27940" numCol="1" spcCol="1270" anchor="ctr" anchorCtr="0">
+          <a:noAutofit/>
+        </a:bodyPr>
+        <a:lstStyle/>
+        <a:p>
+          <a:pPr marL="0" lvl="0" indent="0" algn="r" defTabSz="466725">
+            <a:lnSpc>
+              <a:spcPct val="90000"/>
+            </a:lnSpc>
+            <a:spcBef>
+              <a:spcPct val="0"/>
+            </a:spcBef>
+            <a:spcAft>
+              <a:spcPct val="35000"/>
+            </a:spcAft>
+            <a:buNone/>
+          </a:pPr>
+          <a:r>
+            <a:rPr lang="en-CA" sz="1050" kern="1200"/>
+            <a:t>.ncExtract.R</a:t>
+          </a:r>
+        </a:p>
+      </dsp:txBody>
+      <dsp:txXfrm>
+        <a:off x="0" y="1094681"/>
+        <a:ext cx="1371600" cy="851400"/>
+      </dsp:txXfrm>
+    </dsp:sp>
+    <dsp:sp modelId="{4FF43A53-3DA8-4CFC-A402-E663CF2F04C3}">
+      <dsp:nvSpPr>
+        <dsp:cNvPr id="0" name=""/>
+        <dsp:cNvSpPr/>
+      </dsp:nvSpPr>
+      <dsp:spPr>
+        <a:xfrm>
+          <a:off x="1371599" y="1014862"/>
+          <a:ext cx="274320" cy="1011037"/>
+        </a:xfrm>
+        <a:prstGeom prst="leftBrace">
+          <a:avLst>
+            <a:gd name="adj1" fmla="val 35000"/>
+            <a:gd name="adj2" fmla="val 50000"/>
+          </a:avLst>
+        </a:prstGeom>
+        <a:noFill/>
+        <a:ln w="19050" cap="flat" cmpd="sng" algn="ctr">
+          <a:solidFill>
+            <a:schemeClr val="accent1">
+              <a:shade val="60000"/>
+              <a:hueOff val="0"/>
+              <a:satOff val="0"/>
+              <a:lumOff val="0"/>
+              <a:alphaOff val="0"/>
+            </a:schemeClr>
+          </a:solidFill>
+          <a:prstDash val="solid"/>
+          <a:miter lim="800000"/>
+        </a:ln>
+        <a:effectLst/>
+      </dsp:spPr>
+      <dsp:style>
+        <a:lnRef idx="2">
+          <a:scrgbClr r="0" g="0" b="0"/>
+        </a:lnRef>
+        <a:fillRef idx="0">
+          <a:scrgbClr r="0" g="0" b="0"/>
+        </a:fillRef>
+        <a:effectRef idx="0">
+          <a:scrgbClr r="0" g="0" b="0"/>
+        </a:effectRef>
+        <a:fontRef idx="minor"/>
+      </dsp:style>
+    </dsp:sp>
+    <dsp:sp modelId="{B8A45921-2C5B-4464-841D-5D5AEF216018}">
+      <dsp:nvSpPr>
+        <dsp:cNvPr id="0" name=""/>
+        <dsp:cNvSpPr/>
+      </dsp:nvSpPr>
+      <dsp:spPr>
+        <a:xfrm>
+          <a:off x="1755647" y="1014862"/>
+          <a:ext cx="3730752" cy="1011037"/>
+        </a:xfrm>
+        <a:prstGeom prst="rect">
+          <a:avLst/>
+        </a:prstGeom>
+        <a:solidFill>
+          <a:schemeClr val="accent1">
+            <a:hueOff val="0"/>
+            <a:satOff val="0"/>
+            <a:lumOff val="0"/>
+            <a:alphaOff val="0"/>
+          </a:schemeClr>
+        </a:solidFill>
+        <a:ln w="19050" cap="flat" cmpd="sng" algn="ctr">
+          <a:solidFill>
+            <a:schemeClr val="lt1">
+              <a:hueOff val="0"/>
+              <a:satOff val="0"/>
+              <a:lumOff val="0"/>
+              <a:alphaOff val="0"/>
+            </a:schemeClr>
+          </a:solidFill>
+          <a:prstDash val="solid"/>
+          <a:miter lim="800000"/>
+        </a:ln>
+        <a:effectLst/>
+      </dsp:spPr>
+      <dsp:style>
+        <a:lnRef idx="2">
+          <a:scrgbClr r="0" g="0" b="0"/>
+        </a:lnRef>
+        <a:fillRef idx="1">
+          <a:scrgbClr r="0" g="0" b="0"/>
+        </a:fillRef>
+        <a:effectRef idx="0">
+          <a:scrgbClr r="0" g="0" b="0"/>
+        </a:effectRef>
+        <a:fontRef idx="minor">
+          <a:schemeClr val="lt1"/>
+        </a:fontRef>
+      </dsp:style>
+      <dsp:txBody>
+        <a:bodyPr spcFirstLastPara="0" vert="horz" wrap="square" lIns="41910" tIns="41910" rIns="41910" bIns="41910" numCol="1" spcCol="1270" anchor="ctr" anchorCtr="0">
+          <a:noAutofit/>
+        </a:bodyPr>
+        <a:lstStyle/>
+        <a:p>
+          <a:pPr marL="57150" lvl="1" indent="-57150" algn="l" defTabSz="466725">
+            <a:lnSpc>
+              <a:spcPct val="90000"/>
+            </a:lnSpc>
+            <a:spcBef>
+              <a:spcPct val="0"/>
+            </a:spcBef>
+            <a:spcAft>
+              <a:spcPct val="15000"/>
+            </a:spcAft>
+            <a:buChar char="•"/>
+          </a:pPr>
+          <a:r>
+            <a:rPr lang="en-CA" sz="1050" kern="1200"/>
+            <a:t>brings in data from the CASTS site and creates a dataframe of CTD data that was either classified as the Prince 5 station, or other DFO data collections on the Scots Bay and German Bank/Seal Island area that can be combined with the HSC data to increase the sample size</a:t>
+          </a:r>
+        </a:p>
+        <a:p>
+          <a:pPr marL="57150" lvl="1" indent="-57150" algn="l" defTabSz="466725">
+            <a:lnSpc>
+              <a:spcPct val="90000"/>
+            </a:lnSpc>
+            <a:spcBef>
+              <a:spcPct val="0"/>
+            </a:spcBef>
+            <a:spcAft>
+              <a:spcPct val="15000"/>
+            </a:spcAft>
+            <a:buChar char="•"/>
+          </a:pPr>
+          <a:r>
+            <a:rPr lang="en-CA" sz="1050" kern="1200"/>
+            <a:t>For Prince 5 this includes data from 2017 to 2023</a:t>
+          </a:r>
+        </a:p>
+      </dsp:txBody>
+      <dsp:txXfrm>
+        <a:off x="1755647" y="1014862"/>
+        <a:ext cx="3730752" cy="1011037"/>
+      </dsp:txXfrm>
+    </dsp:sp>
+    <dsp:sp modelId="{8BB60D3E-FB86-4F6F-B1D8-C44BAAB50A38}">
+      <dsp:nvSpPr>
+        <dsp:cNvPr id="0" name=""/>
+        <dsp:cNvSpPr/>
+      </dsp:nvSpPr>
+      <dsp:spPr>
+        <a:xfrm>
+          <a:off x="0" y="2260518"/>
+          <a:ext cx="1371600" cy="851400"/>
+        </a:xfrm>
+        <a:prstGeom prst="rect">
+          <a:avLst/>
+        </a:prstGeom>
+        <a:noFill/>
+        <a:ln>
+          <a:noFill/>
+        </a:ln>
+        <a:effectLst/>
+      </dsp:spPr>
+      <dsp:style>
+        <a:lnRef idx="0">
+          <a:scrgbClr r="0" g="0" b="0"/>
+        </a:lnRef>
+        <a:fillRef idx="0">
+          <a:scrgbClr r="0" g="0" b="0"/>
+        </a:fillRef>
+        <a:effectRef idx="0">
+          <a:scrgbClr r="0" g="0" b="0"/>
+        </a:effectRef>
+        <a:fontRef idx="minor"/>
+      </dsp:style>
+      <dsp:txBody>
+        <a:bodyPr spcFirstLastPara="0" vert="horz" wrap="square" lIns="78232" tIns="27940" rIns="78232" bIns="27940" numCol="1" spcCol="1270" anchor="ctr" anchorCtr="0">
+          <a:noAutofit/>
+        </a:bodyPr>
+        <a:lstStyle/>
+        <a:p>
+          <a:pPr marL="0" lvl="0" indent="0" algn="r" defTabSz="466725">
+            <a:lnSpc>
+              <a:spcPct val="90000"/>
+            </a:lnSpc>
+            <a:spcBef>
+              <a:spcPct val="0"/>
+            </a:spcBef>
+            <a:spcAft>
+              <a:spcPct val="35000"/>
+            </a:spcAft>
+            <a:buNone/>
+          </a:pPr>
+          <a:r>
+            <a:rPr lang="en-CA" sz="1050" kern="1200"/>
+            <a:t>rerdapp.R</a:t>
+          </a:r>
+        </a:p>
+      </dsp:txBody>
+      <dsp:txXfrm>
+        <a:off x="0" y="2260518"/>
+        <a:ext cx="1371600" cy="851400"/>
+      </dsp:txXfrm>
+    </dsp:sp>
+    <dsp:sp modelId="{14F98FF1-4158-4210-8D48-AACF65D1D83A}">
+      <dsp:nvSpPr>
+        <dsp:cNvPr id="0" name=""/>
+        <dsp:cNvSpPr/>
+      </dsp:nvSpPr>
+      <dsp:spPr>
+        <a:xfrm>
+          <a:off x="1371599" y="2180700"/>
+          <a:ext cx="274320" cy="1011037"/>
+        </a:xfrm>
+        <a:prstGeom prst="leftBrace">
+          <a:avLst>
+            <a:gd name="adj1" fmla="val 35000"/>
+            <a:gd name="adj2" fmla="val 50000"/>
+          </a:avLst>
+        </a:prstGeom>
+        <a:noFill/>
+        <a:ln w="19050" cap="flat" cmpd="sng" algn="ctr">
+          <a:solidFill>
+            <a:schemeClr val="accent1">
+              <a:shade val="60000"/>
+              <a:hueOff val="0"/>
+              <a:satOff val="0"/>
+              <a:lumOff val="0"/>
+              <a:alphaOff val="0"/>
+            </a:schemeClr>
+          </a:solidFill>
+          <a:prstDash val="solid"/>
+          <a:miter lim="800000"/>
+        </a:ln>
+        <a:effectLst/>
+      </dsp:spPr>
+      <dsp:style>
+        <a:lnRef idx="2">
+          <a:scrgbClr r="0" g="0" b="0"/>
+        </a:lnRef>
+        <a:fillRef idx="0">
+          <a:scrgbClr r="0" g="0" b="0"/>
+        </a:fillRef>
+        <a:effectRef idx="0">
+          <a:scrgbClr r="0" g="0" b="0"/>
+        </a:effectRef>
+        <a:fontRef idx="minor"/>
+      </dsp:style>
+    </dsp:sp>
+    <dsp:sp modelId="{8E5DF453-1A2E-445C-9157-A7FD19744361}">
+      <dsp:nvSpPr>
+        <dsp:cNvPr id="0" name=""/>
+        <dsp:cNvSpPr/>
+      </dsp:nvSpPr>
+      <dsp:spPr>
+        <a:xfrm>
+          <a:off x="1755647" y="2180700"/>
+          <a:ext cx="3730752" cy="1011037"/>
+        </a:xfrm>
+        <a:prstGeom prst="rect">
+          <a:avLst/>
+        </a:prstGeom>
+        <a:solidFill>
+          <a:schemeClr val="accent1">
+            <a:hueOff val="0"/>
+            <a:satOff val="0"/>
+            <a:lumOff val="0"/>
+            <a:alphaOff val="0"/>
+          </a:schemeClr>
+        </a:solidFill>
+        <a:ln w="19050" cap="flat" cmpd="sng" algn="ctr">
+          <a:solidFill>
+            <a:schemeClr val="lt1">
+              <a:hueOff val="0"/>
+              <a:satOff val="0"/>
+              <a:lumOff val="0"/>
+              <a:alphaOff val="0"/>
+            </a:schemeClr>
+          </a:solidFill>
+          <a:prstDash val="solid"/>
+          <a:miter lim="800000"/>
+        </a:ln>
+        <a:effectLst/>
+      </dsp:spPr>
+      <dsp:style>
+        <a:lnRef idx="2">
+          <a:scrgbClr r="0" g="0" b="0"/>
+        </a:lnRef>
+        <a:fillRef idx="1">
+          <a:scrgbClr r="0" g="0" b="0"/>
+        </a:fillRef>
+        <a:effectRef idx="0">
+          <a:scrgbClr r="0" g="0" b="0"/>
+        </a:effectRef>
+        <a:fontRef idx="minor">
+          <a:schemeClr val="lt1"/>
+        </a:fontRef>
+      </dsp:style>
+      <dsp:txBody>
+        <a:bodyPr spcFirstLastPara="0" vert="horz" wrap="square" lIns="41910" tIns="41910" rIns="41910" bIns="41910" numCol="1" spcCol="1270" anchor="ctr" anchorCtr="0">
+          <a:noAutofit/>
+        </a:bodyPr>
+        <a:lstStyle/>
+        <a:p>
+          <a:pPr marL="57150" lvl="1" indent="-57150" algn="l" defTabSz="466725">
+            <a:lnSpc>
+              <a:spcPct val="90000"/>
+            </a:lnSpc>
+            <a:spcBef>
+              <a:spcPct val="0"/>
+            </a:spcBef>
+            <a:spcAft>
+              <a:spcPct val="15000"/>
+            </a:spcAft>
+            <a:buChar char="•"/>
+          </a:pPr>
+          <a:r>
+            <a:rPr lang="en-CA" sz="1050" kern="1200"/>
+            <a:t>Downloads the 2024 Prince 5 data from the CIOOS site and </a:t>
+          </a:r>
+          <a:r>
+            <a:rPr lang="en-CA" sz="1050" b="0" i="0" kern="1200"/>
+            <a:t>Maritimes Region Atlantic Zone Monitoring Program (AZMP) Rosette Vertical Profiles dataset</a:t>
+          </a:r>
+          <a:endParaRPr lang="en-CA" sz="1050" kern="1200"/>
+        </a:p>
+        <a:p>
+          <a:pPr marL="57150" lvl="1" indent="-57150" algn="l" defTabSz="466725">
+            <a:lnSpc>
+              <a:spcPct val="90000"/>
+            </a:lnSpc>
+            <a:spcBef>
+              <a:spcPct val="0"/>
+            </a:spcBef>
+            <a:spcAft>
+              <a:spcPct val="15000"/>
+            </a:spcAft>
+            <a:buChar char="•"/>
+          </a:pPr>
+          <a:r>
+            <a:rPr lang="en-CA" sz="1050" i="1" kern="1200"/>
+            <a:t>Need to figure out how to get this dataset in the same form as above (gives a downwards and upwards cast rather than just one as when using CASTS)</a:t>
+          </a:r>
+        </a:p>
+      </dsp:txBody>
+      <dsp:txXfrm>
+        <a:off x="1755647" y="2180700"/>
+        <a:ext cx="3730752" cy="1011037"/>
+      </dsp:txXfrm>
+    </dsp:sp>
+  </dsp:spTree>
+</dsp:drawing>
+</file>
+
+<file path=word/diagrams/layout1.xml><?xml version="1.0" encoding="utf-8"?>
+<dgm:layoutDef xmlns:dgm="http://schemas.openxmlformats.org/drawingml/2006/diagram" xmlns:a="http://schemas.openxmlformats.org/drawingml/2006/main" uniqueId="urn:diagrams.loki3.com/BracketList">
+  <dgm:title val="Vertical Bracket List"/>
+  <dgm:desc val="Use to show grouped blocks of information.  Works well with large amounts of Level 2 text."/>
+  <dgm:catLst>
+    <dgm:cat type="list" pri="4110"/>
+    <dgm:cat type="officeonline" pri="3000"/>
+  </dgm:catLst>
+  <dgm:sampData>
+    <dgm:dataModel>
+      <dgm:ptLst>
+        <dgm:pt modelId="0" type="doc"/>
+        <dgm:pt modelId="1">
+          <dgm:prSet phldr="1"/>
+        </dgm:pt>
+        <dgm:pt modelId="11">
+          <dgm:prSet phldr="1"/>
+        </dgm:pt>
+        <dgm:pt modelId="2">
+          <dgm:prSet phldr="1"/>
+        </dgm:pt>
+        <dgm:pt modelId="21">
+          <dgm:prSet phldr="1"/>
+        </dgm:pt>
+      </dgm:ptLst>
+      <dgm:cxnLst>
+        <dgm:cxn modelId="3" srcId="0" destId="1" srcOrd="0" destOrd="0"/>
+        <dgm:cxn modelId="4" srcId="1" destId="11" srcOrd="0" destOrd="0"/>
+        <dgm:cxn modelId="5" srcId="0" destId="2" srcOrd="0" destOrd="0"/>
+        <dgm:cxn modelId="6" srcId="2" destId="21" srcOrd="0" destOrd="0"/>
+      </dgm:cxnLst>
+      <dgm:bg/>
+      <dgm:whole/>
+    </dgm:dataModel>
+  </dgm:sampData>
+  <dgm:styleData useDef="1">
+    <dgm:dataModel>
+      <dgm:ptLst/>
+      <dgm:bg/>
+      <dgm:whole/>
+    </dgm:dataModel>
+  </dgm:styleData>
+  <dgm:clrData useDef="1">
+    <dgm:dataModel>
+      <dgm:ptLst/>
+      <dgm:bg/>
+      <dgm:whole/>
+    </dgm:dataModel>
+  </dgm:clrData>
+  <dgm:layoutNode name="Name0">
+    <dgm:varLst>
+      <dgm:dir/>
+      <dgm:animLvl val="lvl"/>
+      <dgm:resizeHandles val="exact"/>
+    </dgm:varLst>
+    <dgm:choose name="Name1">
+      <dgm:if name="Name2" func="var" arg="dir" op="equ" val="norm">
+        <dgm:alg type="lin">
+          <dgm:param type="linDir" val="fromT"/>
+          <dgm:param type="nodeHorzAlign" val="l"/>
+        </dgm:alg>
+      </dgm:if>
+      <dgm:else name="Name3">
+        <dgm:alg type="lin">
+          <dgm:param type="linDir" val="fromT"/>
+          <dgm:param type="nodeHorzAlign" val="r"/>
+        </dgm:alg>
+      </dgm:else>
+    </dgm:choose>
+    <dgm:shape xmlns:r="http://schemas.openxmlformats.org/officeDocument/2006/relationships" r:blip="">
+      <dgm:adjLst/>
+    </dgm:shape>
+    <dgm:presOf/>
+    <dgm:constrLst>
+      <dgm:constr type="h" for="ch" forName="linNode" refType="h"/>
+      <dgm:constr type="w" for="ch" forName="linNode" refType="w"/>
+      <dgm:constr type="h" for="ch" forName="spV" refType="primFontSz" refFor="des" refForName="parTx" fact="0.1"/>
+      <dgm:constr type="primFontSz" for="des" forName="parTx" val="65"/>
+      <dgm:constr type="primFontSz" for="des" forName="desTx" refType="primFontSz" refFor="des" refForName="parTx"/>
+      <dgm:constr type="h" for="des" forName="parTx" refType="primFontSz" refFor="des" refForName="parTx" fact="0.55"/>
+      <dgm:constr type="h" for="des" forName="bracket" refType="primFontSz" refFor="des" refForName="parTx" fact="0.55"/>
+      <dgm:constr type="h" for="des" forName="desTx" refType="primFontSz" refFor="des" refForName="parTx" fact="0.55"/>
+    </dgm:constrLst>
+    <dgm:ruleLst>
+      <dgm:rule type="primFontSz" for="des" forName="parTx" val="5" fact="NaN" max="NaN"/>
+    </dgm:ruleLst>
+    <dgm:forEach name="Name4" axis="ch" ptType="node">
+      <dgm:layoutNode name="linNode">
+        <dgm:choose name="Name5">
+          <dgm:if name="Name6" func="var" arg="dir" op="equ" val="norm">
+            <dgm:alg type="lin">
+              <dgm:param type="linDir" val="fromL"/>
+            </dgm:alg>
+          </dgm:if>
+          <dgm:else name="Name7">
+            <dgm:alg type="lin">
+              <dgm:param type="linDir" val="fromR"/>
+            </dgm:alg>
+          </dgm:else>
+        </dgm:choose>
+        <dgm:shape xmlns:r="http://schemas.openxmlformats.org/officeDocument/2006/relationships" r:blip="">
+          <dgm:adjLst/>
+        </dgm:shape>
+        <dgm:presOf/>
+        <dgm:constrLst>
+          <dgm:constr type="w" for="ch" forName="parTx" refType="w" fact="0.25"/>
+          <dgm:constr type="w" for="ch" forName="bracket" refType="w" fact="0.05"/>
+          <dgm:constr type="w" for="ch" forName="spH" refType="w" fact="0.02"/>
+          <dgm:constr type="w" for="ch" forName="desTx" refType="w" fact="0.68"/>
+          <dgm:constr type="h" for="ch" forName="bracket" refType="h" refFor="ch" refForName="desTx" op="gte"/>
+          <dgm:constr type="h" for="ch" forName="bracket" refType="h" refFor="ch" refForName="parTx" op="gte"/>
+          <dgm:constr type="h" for="ch" forName="desTx" refType="h" refFor="ch" refForName="parTx" op="gte"/>
+        </dgm:constrLst>
+        <dgm:ruleLst/>
+        <dgm:layoutNode name="parTx" styleLbl="revTx">
+          <dgm:varLst>
+            <dgm:chMax val="1"/>
+            <dgm:bulletEnabled val="1"/>
+          </dgm:varLst>
+          <dgm:choose name="Name8">
+            <dgm:if name="Name9" func="var" arg="dir" op="equ" val="norm">
+              <dgm:alg type="tx">
+                <dgm:param type="parTxLTRAlign" val="r"/>
+              </dgm:alg>
+            </dgm:if>
+            <dgm:else name="Name10">
+              <dgm:alg type="tx">
+                <dgm:param type="parTxLTRAlign" val="l"/>
+              </dgm:alg>
+            </dgm:else>
+          </dgm:choose>
+          <dgm:shape xmlns:r="http://schemas.openxmlformats.org/officeDocument/2006/relationships" type="rect" r:blip="">
+            <dgm:adjLst/>
+          </dgm:shape>
+          <dgm:presOf axis="self" ptType="node"/>
+          <dgm:constrLst>
+            <dgm:constr type="tMarg" refType="primFontSz" fact="0.2"/>
+            <dgm:constr type="bMarg" refType="primFontSz" fact="0.2"/>
+          </dgm:constrLst>
+          <dgm:ruleLst>
+            <dgm:rule type="h" val="INF" fact="NaN" max="NaN"/>
+          </dgm:ruleLst>
+        </dgm:layoutNode>
+        <dgm:layoutNode name="bracket" styleLbl="parChTrans1D1">
+          <dgm:alg type="sp"/>
+          <dgm:choose name="Name11">
+            <dgm:if name="Name12" func="var" arg="dir" op="equ" val="norm">
+              <dgm:shape xmlns:r="http://schemas.openxmlformats.org/officeDocument/2006/relationships" type="leftBrace" r:blip="">
+                <dgm:adjLst>
+                  <dgm:adj idx="1" val="0.35"/>
+                </dgm:adjLst>
+              </dgm:shape>
+            </dgm:if>
+            <dgm:else name="Name13">
+              <dgm:shape xmlns:r="http://schemas.openxmlformats.org/officeDocument/2006/relationships" rot="180" type="leftBrace" r:blip="">
+                <dgm:adjLst>
+                  <dgm:adj idx="1" val="0.35"/>
+                </dgm:adjLst>
+              </dgm:shape>
+            </dgm:else>
+          </dgm:choose>
+          <dgm:presOf/>
+        </dgm:layoutNode>
+        <dgm:layoutNode name="spH">
+          <dgm:alg type="sp"/>
+        </dgm:layoutNode>
+        <dgm:choose name="Name14">
+          <dgm:if name="Name15" axis="ch" ptType="node" func="cnt" op="gte" val="1">
+            <dgm:layoutNode name="desTx" styleLbl="node1">
+              <dgm:varLst>
+                <dgm:bulletEnabled val="1"/>
+              </dgm:varLst>
+              <dgm:alg type="tx">
+                <dgm:param type="stBulletLvl" val="1"/>
+                <dgm:param type="txAnchorVertCh" val="mid"/>
+              </dgm:alg>
+              <dgm:shape xmlns:r="http://schemas.openxmlformats.org/officeDocument/2006/relationships" type="rect" r:blip="">
+                <dgm:adjLst/>
+              </dgm:shape>
+              <dgm:presOf axis="des" ptType="node"/>
+              <dgm:constrLst>
+                <dgm:constr type="secFontSz" refType="primFontSz"/>
+                <dgm:constr type="tMarg" refType="primFontSz" fact="0.3"/>
+                <dgm:constr type="bMarg" refType="primFontSz" fact="0.3"/>
+                <dgm:constr type="lMarg" refType="primFontSz" fact="0.3"/>
+                <dgm:constr type="rMarg" refType="primFontSz" fact="0.3"/>
+              </dgm:constrLst>
+              <dgm:ruleLst>
+                <dgm:rule type="h" val="INF" fact="NaN" max="NaN"/>
+              </dgm:ruleLst>
+            </dgm:layoutNode>
+          </dgm:if>
+          <dgm:else name="Name16"/>
+        </dgm:choose>
+      </dgm:layoutNode>
+      <dgm:forEach name="Name17" axis="followSib" ptType="sibTrans" cnt="1">
+        <dgm:layoutNode name="spV">
+          <dgm:alg type="sp"/>
+        </dgm:layoutNode>
+      </dgm:forEach>
+    </dgm:forEach>
+  </dgm:layoutNode>
+</dgm:layoutDef>
+</file>
+
+<file path=word/diagrams/quickStyle1.xml><?xml version="1.0" encoding="utf-8"?>
+<dgm:styleDef xmlns:dgm="http://schemas.openxmlformats.org/drawingml/2006/diagram" xmlns:a="http://schemas.openxmlformats.org/drawingml/2006/main" uniqueId="urn:microsoft.com/office/officeart/2005/8/quickstyle/simple1">
+  <dgm:title val=""/>
+  <dgm:desc val=""/>
+  <dgm:catLst>
+    <dgm:cat type="simple" pri="10100"/>
+  </dgm:catLst>
+  <dgm:scene3d>
+    <a:camera prst="orthographicFront"/>
+    <a:lightRig rig="threePt" dir="t"/>
+  </dgm:scene3d>
+  <dgm:styleLbl name="node0">
+    <dgm:scene3d>
+      <a:camera prst="orthographicFront"/>
+      <a:lightRig rig="threePt" dir="t"/>
+    </dgm:scene3d>
+    <dgm:sp3d/>
+    <dgm:txPr/>
+    <dgm:style>
+      <a:lnRef idx="2">
+        <a:scrgbClr r="0" g="0" b="0"/>
+      </a:lnRef>
+      <a:fillRef idx="1">
+        <a:scrgbClr r="0" g="0" b="0"/>
+      </a:fillRef>
+      <a:effectRef idx="0">
+        <a:scrgbClr r="0" g="0" b="0"/>
+      </a:effectRef>
+      <a:fontRef idx="minor">
+        <a:schemeClr val="lt1"/>
+      </a:fontRef>
+    </dgm:style>
+  </dgm:styleLbl>
+  <dgm:styleLbl name="lnNode1">
+    <dgm:scene3d>
+      <a:camera prst="orthographicFront"/>
+      <a:lightRig rig="threePt" dir="t"/>
+    </dgm:scene3d>
+    <dgm:sp3d/>
+    <dgm:txPr/>
+    <dgm:style>
+      <a:lnRef idx="2">
+        <a:scrgbClr r="0" g="0" b="0"/>
+      </a:lnRef>
+      <a:fillRef idx="1">
+        <a:scrgbClr r="0" g="0" b="0"/>
+      </a:fillRef>
+      <a:effectRef idx="0">
+        <a:scrgbClr r="0" g="0" b="0"/>
+      </a:effectRef>
+      <a:fontRef idx="minor">
+        <a:schemeClr val="lt1"/>
+      </a:fontRef>
+    </dgm:style>
+  </dgm:styleLbl>
+  <dgm:styleLbl name="vennNode1">
+    <dgm:scene3d>
+      <a:camera prst="orthographicFront"/>
+      <a:lightRig rig="threePt" dir="t"/>
+    </dgm:scene3d>
+    <dgm:sp3d/>
+    <dgm:txPr/>
+    <dgm:style>
+      <a:lnRef idx="2">
+        <a:scrgbClr r="0" g="0" b="0"/>
+      </a:lnRef>
+      <a:fillRef idx="1">
+        <a:scrgbClr r="0" g="0" b="0"/>
+      </a:fillRef>
+      <a:effectRef idx="0">
+        <a:scrgbClr r="0" g="0" b="0"/>
+      </a:effectRef>
+      <a:fontRef idx="minor">
+        <a:schemeClr val="tx1"/>
+      </a:fontRef>
+    </dgm:style>
+  </dgm:styleLbl>
+  <dgm:styleLbl name="alignNode1">
+    <dgm:scene3d>
+      <a:camera prst="orthographicFront"/>
+      <a:lightRig rig="threePt" dir="t"/>
+    </dgm:scene3d>
+    <dgm:sp3d/>
+    <dgm:txPr/>
+    <dgm:style>
+      <a:lnRef idx="2">
+        <a:scrgbClr r="0" g="0" b="0"/>
+      </a:lnRef>
+      <a:fillRef idx="1">
+        <a:scrgbClr r="0" g="0" b="0"/>
+      </a:fillRef>
+      <a:effectRef idx="0">
+        <a:scrgbClr r="0" g="0" b="0"/>
+      </a:effectRef>
+      <a:fontRef idx="minor">
+        <a:schemeClr val="lt1"/>
+      </a:fontRef>
+    </dgm:style>
+  </dgm:styleLbl>
+  <dgm:styleLbl name="node1">
+    <dgm:scene3d>
+      <a:camera prst="orthographicFront"/>
+      <a:lightRig rig="threePt" dir="t"/>
+    </dgm:scene3d>
+    <dgm:sp3d/>
+    <dgm:txPr/>
+    <dgm:style>
+      <a:lnRef idx="2">
+        <a:scrgbClr r="0" g="0" b="0"/>
+      </a:lnRef>
+      <a:fillRef idx="1">
+        <a:scrgbClr r="0" g="0" b="0"/>
+      </a:fillRef>
+      <a:effectRef idx="0">
+        <a:scrgbClr r="0" g="0" b="0"/>
+      </a:effectRef>
+      <a:fontRef idx="minor">
+        <a:schemeClr val="lt1"/>
+      </a:fontRef>
+    </dgm:style>
+  </dgm:styleLbl>
+  <dgm:styleLbl name="node2">
+    <dgm:scene3d>
+      <a:camera prst="orthographicFront"/>
+      <a:lightRig rig="threePt" dir="t"/>
+    </dgm:scene3d>
+    <dgm:sp3d/>
+    <dgm:txPr/>
+    <dgm:style>
+      <a:lnRef idx="2">
+        <a:scrgbClr r="0" g="0" b="0"/>
+      </a:lnRef>
+      <a:fillRef idx="1">
+        <a:scrgbClr r="0" g="0" b="0"/>
+      </a:fillRef>
+      <a:effectRef idx="0">
+        <a:scrgbClr r="0" g="0" b="0"/>
+      </a:effectRef>
+      <a:fontRef idx="minor">
+        <a:schemeClr val="lt1"/>
+      </a:fontRef>
+    </dgm:style>
+  </dgm:styleLbl>
+  <dgm:styleLbl name="node3">
+    <dgm:scene3d>
+      <a:camera prst="orthographicFront"/>
+      <a:lightRig rig="threePt" dir="t"/>
+    </dgm:scene3d>
+    <dgm:sp3d/>
+    <dgm:txPr/>
+    <dgm:style>
+      <a:lnRef idx="2">
+        <a:scrgbClr r="0" g="0" b="0"/>
+      </a:lnRef>
+      <a:fillRef idx="1">
+        <a:scrgbClr r="0" g="0" b="0"/>
+      </a:fillRef>
+      <a:effectRef idx="0">
+        <a:scrgbClr r="0" g="0" b="0"/>
+      </a:effectRef>
+      <a:fontRef idx="minor">
+        <a:schemeClr val="lt1"/>
+      </a:fontRef>
+    </dgm:style>
+  </dgm:styleLbl>
+  <dgm:styleLbl name="node4">
+    <dgm:scene3d>
+      <a:camera prst="orthographicFront"/>
+      <a:lightRig rig="threePt" dir="t"/>
+    </dgm:scene3d>
+    <dgm:sp3d/>
+    <dgm:txPr/>
+    <dgm:style>
+      <a:lnRef idx="2">
+        <a:scrgbClr r="0" g="0" b="0"/>
+      </a:lnRef>
+      <a:fillRef idx="1">
+        <a:scrgbClr r="0" g="0" b="0"/>
+      </a:fillRef>
+      <a:effectRef idx="0">
+        <a:scrgbClr r="0" g="0" b="0"/>
+      </a:effectRef>
+      <a:fontRef idx="minor">
+        <a:schemeClr val="lt1"/>
+      </a:fontRef>
+    </dgm:style>
+  </dgm:styleLbl>
+  <dgm:styleLbl name="fgImgPlace1">
+    <dgm:scene3d>
+      <a:camera prst="orthographicFront"/>
+      <a:lightRig rig="threePt" dir="t"/>
+    </dgm:scene3d>
+    <dgm:sp3d/>
+    <dgm:txPr/>
+    <dgm:style>
+      <a:lnRef idx="2">
+        <a:scrgbClr r="0" g="0" b="0"/>
+      </a:lnRef>
+      <a:fillRef idx="1">
+        <a:scrgbClr r="0" g="0" b="0"/>
+      </a:fillRef>
+      <a:effectRef idx="0">
+        <a:scrgbClr r="0" g="0" b="0"/>
+      </a:effectRef>
+      <a:fontRef idx="minor"/>
+    </dgm:style>
+  </dgm:styleLbl>
+  <dgm:styleLbl name="alignImgPlace1">
+    <dgm:scene3d>
+      <a:camera prst="orthographicFront"/>
+      <a:lightRig rig="threePt" dir="t"/>
+    </dgm:scene3d>
+    <dgm:sp3d/>
+    <dgm:txPr/>
+    <dgm:style>
+      <a:lnRef idx="2">
+        <a:scrgbClr r="0" g="0" b="0"/>
+      </a:lnRef>
+      <a:fillRef idx="1">
+        <a:scrgbClr r="0" g="0" b="0"/>
+      </a:fillRef>
+      <a:effectRef idx="0">
+        <a:scrgbClr r="0" g="0" b="0"/>
+      </a:effectRef>
+      <a:fontRef idx="minor"/>
+    </dgm:style>
+  </dgm:styleLbl>
+  <dgm:styleLbl name="bgImgPlace1">
+    <dgm:scene3d>
+      <a:camera prst="orthographicFront"/>
+      <a:lightRig rig="threePt" dir="t"/>
+    </dgm:scene3d>
+    <dgm:sp3d/>
+    <dgm:txPr/>
+    <dgm:style>
+      <a:lnRef idx="2">
+        <a:scrgbClr r="0" g="0" b="0"/>
+      </a:lnRef>
+      <a:fillRef idx="1">
+        <a:scrgbClr r="0" g="0" b="0"/>
+      </a:fillRef>
+      <a:effectRef idx="0">
+        <a:scrgbClr r="0" g="0" b="0"/>
+      </a:effectRef>
+      <a:fontRef idx="minor"/>
+    </dgm:style>
+  </dgm:styleLbl>
+  <dgm:styleLbl name="sibTrans2D1">
+    <dgm:scene3d>
+      <a:camera prst="orthographicFront"/>
+      <a:lightRig rig="threePt" dir="t"/>
+    </dgm:scene3d>
+    <dgm:sp3d/>
+    <dgm:txPr/>
+    <dgm:style>
+      <a:lnRef idx="0">
+        <a:scrgbClr r="0" g="0" b="0"/>
+      </a:lnRef>
+      <a:fillRef idx="1">
+        <a:scrgbClr r="0" g="0" b="0"/>
+      </a:fillRef>
+      <a:effectRef idx="0">
+        <a:scrgbClr r="0" g="0" b="0"/>
+      </a:effectRef>
+      <a:fontRef idx="minor">
+        <a:schemeClr val="lt1"/>
+      </a:fontRef>
+    </dgm:style>
+  </dgm:styleLbl>
+  <dgm:styleLbl name="fgSibTrans2D1">
+    <dgm:scene3d>
+      <a:camera prst="orthographicFront"/>
+      <a:lightRig rig="threePt" dir="t"/>
+    </dgm:scene3d>
+    <dgm:sp3d/>
+    <dgm:txPr/>
+    <dgm:style>
+      <a:lnRef idx="0">
+        <a:scrgbClr r="0" g="0" b="0"/>
+      </a:lnRef>
+      <a:fillRef idx="1">
+        <a:scrgbClr r="0" g="0" b="0"/>
+      </a:fillRef>
+      <a:effectRef idx="0">
+        <a:scrgbClr r="0" g="0" b="0"/>
+      </a:effectRef>
+      <a:fontRef idx="minor">
+        <a:schemeClr val="lt1"/>
+      </a:fontRef>
+    </dgm:style>
+  </dgm:styleLbl>
+  <dgm:styleLbl name="bgSibTrans2D1">
+    <dgm:scene3d>
+      <a:camera prst="orthographicFront"/>
+      <a:lightRig rig="threePt" dir="t"/>
+    </dgm:scene3d>
+    <dgm:sp3d/>
+    <dgm:txPr/>
+    <dgm:style>
+      <a:lnRef idx="0">
+        <a:scrgbClr r="0" g="0" b="0"/>
+      </a:lnRef>
+      <a:fillRef idx="1">
+        <a:scrgbClr r="0" g="0" b="0"/>
+      </a:fillRef>
+      <a:effectRef idx="0">
+        <a:scrgbClr r="0" g="0" b="0"/>
+      </a:effectRef>
+      <a:fontRef idx="minor">
+        <a:schemeClr val="lt1"/>
+      </a:fontRef>
+    </dgm:style>
+  </dgm:styleLbl>
+  <dgm:styleLbl name="sibTrans1D1">
+    <dgm:scene3d>
+      <a:camera prst="orthographicFront"/>
+      <a:lightRig rig="threePt" dir="t"/>
+    </dgm:scene3d>
+    <dgm:sp3d/>
+    <dgm:txPr/>
+    <dgm:style>
+      <a:lnRef idx="1">
+        <a:scrgbClr r="0" g="0" b="0"/>
+      </a:lnRef>
+      <a:fillRef idx="0">
+        <a:scrgbClr r="0" g="0" b="0"/>
+      </a:fillRef>
+      <a:effectRef idx="0">
+        <a:scrgbClr r="0" g="0" b="0"/>
+      </a:effectRef>
+      <a:fontRef idx="minor"/>
+    </dgm:style>
+  </dgm:styleLbl>
+  <dgm:styleLbl name="callout">
+    <dgm:scene3d>
+      <a:camera prst="orthographicFront"/>
+      <a:lightRig rig="threePt" dir="t"/>
+    </dgm:scene3d>
+    <dgm:sp3d/>
+    <dgm:txPr/>
+    <dgm:style>
+      <a:lnRef idx="2">
+        <a:scrgbClr r="0" g="0" b="0"/>
+      </a:lnRef>
+      <a:fillRef idx="1">
+        <a:scrgbClr r="0" g="0" b="0"/>
+      </a:fillRef>
+      <a:effectRef idx="0">
+        <a:scrgbClr r="0" g="0" b="0"/>
+      </a:effectRef>
+      <a:fontRef idx="minor"/>
+    </dgm:style>
+  </dgm:styleLbl>
+  <dgm:styleLbl name="asst0">
+    <dgm:scene3d>
+      <a:camera prst="orthographicFront"/>
+      <a:lightRig rig="threePt" dir="t"/>
+    </dgm:scene3d>
+    <dgm:sp3d/>
+    <dgm:txPr/>
+    <dgm:style>
+      <a:lnRef idx="2">
+        <a:scrgbClr r="0" g="0" b="0"/>
+      </a:lnRef>
+      <a:fillRef idx="1">
+        <a:scrgbClr r="0" g="0" b="0"/>
+      </a:fillRef>
+      <a:effectRef idx="0">
+        <a:scrgbClr r="0" g="0" b="0"/>
+      </a:effectRef>
+      <a:fontRef idx="minor">
+        <a:schemeClr val="lt1"/>
+      </a:fontRef>
+    </dgm:style>
+  </dgm:styleLbl>
+  <dgm:styleLbl name="asst1">
+    <dgm:scene3d>
+      <a:camera prst="orthographicFront"/>
+      <a:lightRig rig="threePt" dir="t"/>
+    </dgm:scene3d>
+    <dgm:sp3d/>
+    <dgm:txPr/>
+    <dgm:style>
+      <a:lnRef idx="2">
+        <a:scrgbClr r="0" g="0" b="0"/>
+      </a:lnRef>
+      <a:fillRef idx="1">
+        <a:scrgbClr r="0" g="0" b="0"/>
+      </a:fillRef>
+      <a:effectRef idx="0">
+        <a:scrgbClr r="0" g="0" b="0"/>
+      </a:effectRef>
+      <a:fontRef idx="minor">
+        <a:schemeClr val="lt1"/>
+      </a:fontRef>
+    </dgm:style>
+  </dgm:styleLbl>
+  <dgm:styleLbl name="asst2">
+    <dgm:scene3d>
+      <a:camera prst="orthographicFront"/>
+      <a:lightRig rig="threePt" dir="t"/>
+    </dgm:scene3d>
+    <dgm:sp3d/>
+    <dgm:txPr/>
+    <dgm:style>
+      <a:lnRef idx="2">
+        <a:scrgbClr r="0" g="0" b="0"/>
+      </a:lnRef>
+      <a:fillRef idx="1">
+        <a:scrgbClr r="0" g="0" b="0"/>
+      </a:fillRef>
+      <a:effectRef idx="0">
+        <a:scrgbClr r="0" g="0" b="0"/>
+      </a:effectRef>
+      <a:fontRef idx="minor">
+        <a:schemeClr val="lt1"/>
+      </a:fontRef>
+    </dgm:style>
+  </dgm:styleLbl>
+  <dgm:styleLbl name="asst3">
+    <dgm:scene3d>
+      <a:camera prst="orthographicFront"/>
+      <a:lightRig rig="threePt" dir="t"/>
+    </dgm:scene3d>
+    <dgm:sp3d/>
+    <dgm:txPr/>
+    <dgm:style>
+      <a:lnRef idx="2">
+        <a:scrgbClr r="0" g="0" b="0"/>
+      </a:lnRef>
+      <a:fillRef idx="1">
+        <a:scrgbClr r="0" g="0" b="0"/>
+      </a:fillRef>
+      <a:effectRef idx="0">
+        <a:scrgbClr r="0" g="0" b="0"/>
+      </a:effectRef>
+      <a:fontRef idx="minor">
+        <a:schemeClr val="lt1"/>
+      </a:fontRef>
+    </dgm:style>
+  </dgm:styleLbl>
+  <dgm:styleLbl name="asst4">
+    <dgm:scene3d>
+      <a:camera prst="orthographicFront"/>
+      <a:lightRig rig="threePt" dir="t"/>
+    </dgm:scene3d>
+    <dgm:sp3d/>
+    <dgm:txPr/>
+    <dgm:style>
+      <a:lnRef idx="2">
+        <a:scrgbClr r="0" g="0" b="0"/>
+      </a:lnRef>
+      <a:fillRef idx="1">
+        <a:scrgbClr r="0" g="0" b="0"/>
+      </a:fillRef>
+      <a:effectRef idx="0">
+        <a:scrgbClr r="0" g="0" b="0"/>
+      </a:effectRef>
+      <a:fontRef idx="minor">
+        <a:schemeClr val="lt1"/>
+      </a:fontRef>
+    </dgm:style>
+  </dgm:styleLbl>
+  <dgm:styleLbl name="parChTrans2D1">
+    <dgm:scene3d>
+      <a:camera prst="orthographicFront"/>
+      <a:lightRig rig="threePt" dir="t"/>
+    </dgm:scene3d>
+    <dgm:sp3d/>
+    <dgm:txPr/>
+    <dgm:style>
+      <a:lnRef idx="2">
+        <a:scrgbClr r="0" g="0" b="0"/>
+      </a:lnRef>
+      <a:fillRef idx="1">
+        <a:scrgbClr r="0" g="0" b="0"/>
+      </a:fillRef>
+      <a:effectRef idx="0">
+        <a:scrgbClr r="0" g="0" b="0"/>
+      </a:effectRef>
+      <a:fontRef idx="minor">
+        <a:schemeClr val="lt1"/>
+      </a:fontRef>
+    </dgm:style>
+  </dgm:styleLbl>
+  <dgm:styleLbl name="parChTrans2D2">
+    <dgm:scene3d>
+      <a:camera prst="orthographicFront"/>
+      <a:lightRig rig="threePt" dir="t"/>
+    </dgm:scene3d>
+    <dgm:sp3d/>
+    <dgm:txPr/>
+    <dgm:style>
+      <a:lnRef idx="2">
+        <a:scrgbClr r="0" g="0" b="0"/>
+      </a:lnRef>
+      <a:fillRef idx="1">
+        <a:scrgbClr r="0" g="0" b="0"/>
+      </a:fillRef>
+      <a:effectRef idx="0">
+        <a:scrgbClr r="0" g="0" b="0"/>
+      </a:effectRef>
+      <a:fontRef idx="minor">
+        <a:schemeClr val="lt1"/>
+      </a:fontRef>
+    </dgm:style>
+  </dgm:styleLbl>
+  <dgm:styleLbl name="parChTrans2D3">
+    <dgm:scene3d>
+      <a:camera prst="orthographicFront"/>
+      <a:lightRig rig="threePt" dir="t"/>
+    </dgm:scene3d>
+    <dgm:sp3d/>
+    <dgm:txPr/>
+    <dgm:style>
+      <a:lnRef idx="2">
+        <a:scrgbClr r="0" g="0" b="0"/>
+      </a:lnRef>
+      <a:fillRef idx="1">
+        <a:scrgbClr r="0" g="0" b="0"/>
+      </a:fillRef>
+      <a:effectRef idx="0">
+        <a:scrgbClr r="0" g="0" b="0"/>
+      </a:effectRef>
+      <a:fontRef idx="minor">
+        <a:schemeClr val="lt1"/>
+      </a:fontRef>
+    </dgm:style>
+  </dgm:styleLbl>
+  <dgm:styleLbl name="parChTrans2D4">
+    <dgm:scene3d>
+      <a:camera prst="orthographicFront"/>
+      <a:lightRig rig="threePt" dir="t"/>
+    </dgm:scene3d>
+    <dgm:sp3d/>
+    <dgm:txPr/>
+    <dgm:style>
+      <a:lnRef idx="2">
+        <a:scrgbClr r="0" g="0" b="0"/>
+      </a:lnRef>
+      <a:fillRef idx="1">
+        <a:scrgbClr r="0" g="0" b="0"/>
+      </a:fillRef>
+      <a:effectRef idx="0">
+        <a:scrgbClr r="0" g="0" b="0"/>
+      </a:effectRef>
+      <a:fontRef idx="minor">
+        <a:schemeClr val="lt1"/>
+      </a:fontRef>
+    </dgm:style>
+  </dgm:styleLbl>
+  <dgm:styleLbl name="parChTrans1D1">
+    <dgm:scene3d>
+      <a:camera prst="orthographicFront"/>
+      <a:lightRig rig="threePt" dir="t"/>
+    </dgm:scene3d>
+    <dgm:sp3d/>
+    <dgm:txPr/>
+    <dgm:style>
+      <a:lnRef idx="2">
+        <a:scrgbClr r="0" g="0" b="0"/>
+      </a:lnRef>
+      <a:fillRef idx="0">
+        <a:scrgbClr r="0" g="0" b="0"/>
+      </a:fillRef>
+      <a:effectRef idx="0">
+        <a:scrgbClr r="0" g="0" b="0"/>
+      </a:effectRef>
+      <a:fontRef idx="minor"/>
+    </dgm:style>
+  </dgm:styleLbl>
+  <dgm:styleLbl name="parChTrans1D2">
+    <dgm:scene3d>
+      <a:camera prst="orthographicFront"/>
+      <a:lightRig rig="threePt" dir="t"/>
+    </dgm:scene3d>
+    <dgm:sp3d/>
+    <dgm:txPr/>
+    <dgm:style>
+      <a:lnRef idx="2">
+        <a:scrgbClr r="0" g="0" b="0"/>
+      </a:lnRef>
+      <a:fillRef idx="0">
+        <a:scrgbClr r="0" g="0" b="0"/>
+      </a:fillRef>
+      <a:effectRef idx="0">
+        <a:scrgbClr r="0" g="0" b="0"/>
+      </a:effectRef>
+      <a:fontRef idx="minor"/>
+    </dgm:style>
+  </dgm:styleLbl>
+  <dgm:styleLbl name="parChTrans1D3">
+    <dgm:scene3d>
+      <a:camera prst="orthographicFront"/>
+      <a:lightRig rig="threePt" dir="t"/>
+    </dgm:scene3d>
+    <dgm:sp3d/>
+    <dgm:txPr/>
+    <dgm:style>
+      <a:lnRef idx="2">
+        <a:scrgbClr r="0" g="0" b="0"/>
+      </a:lnRef>
+      <a:fillRef idx="0">
+        <a:scrgbClr r="0" g="0" b="0"/>
+      </a:fillRef>
+      <a:effectRef idx="0">
+        <a:scrgbClr r="0" g="0" b="0"/>
+      </a:effectRef>
+      <a:fontRef idx="minor"/>
+    </dgm:style>
+  </dgm:styleLbl>
+  <dgm:styleLbl name="parChTrans1D4">
+    <dgm:scene3d>
+      <a:camera prst="orthographicFront"/>
+      <a:lightRig rig="threePt" dir="t"/>
+    </dgm:scene3d>
+    <dgm:sp3d/>
+    <dgm:txPr/>
+    <dgm:style>
+      <a:lnRef idx="2">
+        <a:scrgbClr r="0" g="0" b="0"/>
+      </a:lnRef>
+      <a:fillRef idx="0">
+        <a:scrgbClr r="0" g="0" b="0"/>
+      </a:fillRef>
+      <a:effectRef idx="0">
+        <a:scrgbClr r="0" g="0" b="0"/>
+      </a:effectRef>
+      <a:fontRef idx="minor"/>
+    </dgm:style>
+  </dgm:styleLbl>
+  <dgm:styleLbl name="fgAcc1">
+    <dgm:scene3d>
+      <a:camera prst="orthographicFront"/>
+      <a:lightRig rig="threePt" dir="t"/>
+    </dgm:scene3d>
+    <dgm:sp3d/>
+    <dgm:txPr/>
+    <dgm:style>
+      <a:lnRef idx="2">
+        <a:scrgbClr r="0" g="0" b="0"/>
+      </a:lnRef>
+      <a:fillRef idx="1">
+        <a:scrgbClr r="0" g="0" b="0"/>
+      </a:fillRef>
+      <a:effectRef idx="0">
+        <a:scrgbClr r="0" g="0" b="0"/>
+      </a:effectRef>
+      <a:fontRef idx="minor"/>
+    </dgm:style>
+  </dgm:styleLbl>
+  <dgm:styleLbl name="conFgAcc1">
+    <dgm:scene3d>
+      <a:camera prst="orthographicFront"/>
+      <a:lightRig rig="threePt" dir="t"/>
+    </dgm:scene3d>
+    <dgm:sp3d/>
+    <dgm:txPr/>
+    <dgm:style>
+      <a:lnRef idx="2">
+        <a:scrgbClr r="0" g="0" b="0"/>
+      </a:lnRef>
+      <a:fillRef idx="1">
+        <a:scrgbClr r="0" g="0" b="0"/>
+      </a:fillRef>
+      <a:effectRef idx="0">
+        <a:scrgbClr r="0" g="0" b="0"/>
+      </a:effectRef>
+      <a:fontRef idx="minor"/>
+    </dgm:style>
+  </dgm:styleLbl>
+  <dgm:styleLbl name="alignAcc1">
+    <dgm:scene3d>
+      <a:camera prst="orthographicFront"/>
+      <a:lightRig rig="threePt" dir="t"/>
+    </dgm:scene3d>
+    <dgm:sp3d/>
+    <dgm:txPr/>
+    <dgm:style>
+      <a:lnRef idx="2">
+        <a:scrgbClr r="0" g="0" b="0"/>
+      </a:lnRef>
+      <a:fillRef idx="1">
+        <a:scrgbClr r="0" g="0" b="0"/>
+      </a:fillRef>
+      <a:effectRef idx="0">
+        <a:scrgbClr r="0" g="0" b="0"/>
+      </a:effectRef>
+      <a:fontRef idx="minor"/>
+    </dgm:style>
+  </dgm:styleLbl>
+  <dgm:styleLbl name="trAlignAcc1">
+    <dgm:scene3d>
+      <a:camera prst="orthographicFront"/>
+      <a:lightRig rig="threePt" dir="t"/>
+    </dgm:scene3d>
+    <dgm:sp3d/>
+    <dgm:txPr/>
+    <dgm:style>
+      <a:lnRef idx="1">
+        <a:scrgbClr r="0" g="0" b="0"/>
+      </a:lnRef>
+      <a:fillRef idx="1">
+        <a:scrgbClr r="0" g="0" b="0"/>
+      </a:fillRef>
+      <a:effectRef idx="0">
+        <a:scrgbClr r="0" g="0" b="0"/>
+      </a:effectRef>
+      <a:fontRef idx="minor"/>
+    </dgm:style>
+  </dgm:styleLbl>
+  <dgm:styleLbl name="bgAcc1">
+    <dgm:scene3d>
+      <a:camera prst="orthographicFront"/>
+      <a:lightRig rig="threePt" dir="t"/>
+    </dgm:scene3d>
+    <dgm:sp3d/>
+    <dgm:txPr/>
+    <dgm:style>
+      <a:lnRef idx="2">
+        <a:scrgbClr r="0" g="0" b="0"/>
+      </a:lnRef>
+      <a:fillRef idx="1">
+        <a:scrgbClr r="0" g="0" b="0"/>
+      </a:fillRef>
+      <a:effectRef idx="0">
+        <a:scrgbClr r="0" g="0" b="0"/>
+      </a:effectRef>
+      <a:fontRef idx="minor"/>
+    </dgm:style>
+  </dgm:styleLbl>
+  <dgm:styleLbl name="solidFgAcc1">
+    <dgm:scene3d>
+      <a:camera prst="orthographicFront"/>
+      <a:lightRig rig="threePt" dir="t"/>
+    </dgm:scene3d>
+    <dgm:sp3d/>
+    <dgm:txPr/>
+    <dgm:style>
+      <a:lnRef idx="2">
+        <a:scrgbClr r="0" g="0" b="0"/>
+      </a:lnRef>
+      <a:fillRef idx="1">
+        <a:scrgbClr r="0" g="0" b="0"/>
+      </a:fillRef>
+      <a:effectRef idx="0">
+        <a:scrgbClr r="0" g="0" b="0"/>
+      </a:effectRef>
+      <a:fontRef idx="minor"/>
+    </dgm:style>
+  </dgm:styleLbl>
+  <dgm:styleLbl name="solidAlignAcc1">
+    <dgm:scene3d>
+      <a:camera prst="orthographicFront"/>
+      <a:lightRig rig="threePt" dir="t"/>
+    </dgm:scene3d>
+    <dgm:sp3d/>
+    <dgm:txPr/>
+    <dgm:style>
+      <a:lnRef idx="2">
+        <a:scrgbClr r="0" g="0" b="0"/>
+      </a:lnRef>
+      <a:fillRef idx="1">
+        <a:scrgbClr r="0" g="0" b="0"/>
+      </a:fillRef>
+      <a:effectRef idx="0">
+        <a:scrgbClr r="0" g="0" b="0"/>
+      </a:effectRef>
+      <a:fontRef idx="minor"/>
+    </dgm:style>
+  </dgm:styleLbl>
+  <dgm:styleLbl name="solidBgAcc1">
+    <dgm:scene3d>
+      <a:camera prst="orthographicFront"/>
+      <a:lightRig rig="threePt" dir="t"/>
+    </dgm:scene3d>
+    <dgm:sp3d/>
+    <dgm:txPr/>
+    <dgm:style>
+      <a:lnRef idx="2">
+        <a:scrgbClr r="0" g="0" b="0"/>
+      </a:lnRef>
+      <a:fillRef idx="1">
+        <a:scrgbClr r="0" g="0" b="0"/>
+      </a:fillRef>
+      <a:effectRef idx="0">
+        <a:scrgbClr r="0" g="0" b="0"/>
+      </a:effectRef>
+      <a:fontRef idx="minor"/>
+    </dgm:style>
+  </dgm:styleLbl>
+  <dgm:styleLbl name="fgAccFollowNode1">
+    <dgm:scene3d>
+      <a:camera prst="orthographicFront"/>
+      <a:lightRig rig="threePt" dir="t"/>
+    </dgm:scene3d>
+    <dgm:sp3d/>
+    <dgm:txPr/>
+    <dgm:style>
+      <a:lnRef idx="2">
+        <a:scrgbClr r="0" g="0" b="0"/>
+      </a:lnRef>
+      <a:fillRef idx="1">
+        <a:scrgbClr r="0" g="0" b="0"/>
+      </a:fillRef>
+      <a:effectRef idx="0">
+        <a:scrgbClr r="0" g="0" b="0"/>
+      </a:effectRef>
+      <a:fontRef idx="minor"/>
+    </dgm:style>
+  </dgm:styleLbl>
+  <dgm:styleLbl name="alignAccFollowNode1">
+    <dgm:scene3d>
+      <a:camera prst="orthographicFront"/>
+      <a:lightRig rig="threePt" dir="t"/>
+    </dgm:scene3d>
+    <dgm:sp3d/>
+    <dgm:txPr/>
+    <dgm:style>
+      <a:lnRef idx="2">
+        <a:scrgbClr r="0" g="0" b="0"/>
+      </a:lnRef>
+      <a:fillRef idx="1">
+        <a:scrgbClr r="0" g="0" b="0"/>
+      </a:fillRef>
+      <a:effectRef idx="0">
+        <a:scrgbClr r="0" g="0" b="0"/>
+      </a:effectRef>
+      <a:fontRef idx="minor"/>
+    </dgm:style>
+  </dgm:styleLbl>
+  <dgm:styleLbl name="bgAccFollowNode1">
+    <dgm:scene3d>
+      <a:camera prst="orthographicFront"/>
+      <a:lightRig rig="threePt" dir="t"/>
+    </dgm:scene3d>
+    <dgm:sp3d/>
+    <dgm:txPr/>
+    <dgm:style>
+      <a:lnRef idx="2">
+        <a:scrgbClr r="0" g="0" b="0"/>
+      </a:lnRef>
+      <a:fillRef idx="1">
+        <a:scrgbClr r="0" g="0" b="0"/>
+      </a:fillRef>
+      <a:effectRef idx="0">
+        <a:scrgbClr r="0" g="0" b="0"/>
+      </a:effectRef>
+      <a:fontRef idx="minor"/>
+    </dgm:style>
+  </dgm:styleLbl>
+  <dgm:styleLbl name="fgAcc0">
+    <dgm:scene3d>
+      <a:camera prst="orthographicFront"/>
+      <a:lightRig rig="threePt" dir="t"/>
+    </dgm:scene3d>
+    <dgm:sp3d/>
+    <dgm:txPr/>
+    <dgm:style>
+      <a:lnRef idx="2">
+        <a:scrgbClr r="0" g="0" b="0"/>
+      </a:lnRef>
+      <a:fillRef idx="1">
+        <a:scrgbClr r="0" g="0" b="0"/>
+      </a:fillRef>
+      <a:effectRef idx="0">
+        <a:scrgbClr r="0" g="0" b="0"/>
+      </a:effectRef>
+      <a:fontRef idx="minor"/>
+    </dgm:style>
+  </dgm:styleLbl>
+  <dgm:styleLbl name="fgAcc2">
+    <dgm:scene3d>
+      <a:camera prst="orthographicFront"/>
+      <a:lightRig rig="threePt" dir="t"/>
+    </dgm:scene3d>
+    <dgm:sp3d/>
+    <dgm:txPr/>
+    <dgm:style>
+      <a:lnRef idx="2">
+        <a:scrgbClr r="0" g="0" b="0"/>
+      </a:lnRef>
+      <a:fillRef idx="1">
+        <a:scrgbClr r="0" g="0" b="0"/>
+      </a:fillRef>
+      <a:effectRef idx="0">
+        <a:scrgbClr r="0" g="0" b="0"/>
+      </a:effectRef>
+      <a:fontRef idx="minor"/>
+    </dgm:style>
+  </dgm:styleLbl>
+  <dgm:styleLbl name="fgAcc3">
+    <dgm:scene3d>
+      <a:camera prst="orthographicFront"/>
+      <a:lightRig rig="threePt" dir="t"/>
+    </dgm:scene3d>
+    <dgm:sp3d/>
+    <dgm:txPr/>
+    <dgm:style>
+      <a:lnRef idx="2">
+        <a:scrgbClr r="0" g="0" b="0"/>
+      </a:lnRef>
+      <a:fillRef idx="1">
+        <a:scrgbClr r="0" g="0" b="0"/>
+      </a:fillRef>
+      <a:effectRef idx="0">
+        <a:scrgbClr r="0" g="0" b="0"/>
+      </a:effectRef>
+      <a:fontRef idx="minor"/>
+    </dgm:style>
+  </dgm:styleLbl>
+  <dgm:styleLbl name="fgAcc4">
+    <dgm:scene3d>
+      <a:camera prst="orthographicFront"/>
+      <a:lightRig rig="threePt" dir="t"/>
+    </dgm:scene3d>
+    <dgm:sp3d/>
+    <dgm:txPr/>
+    <dgm:style>
+      <a:lnRef idx="2">
+        <a:scrgbClr r="0" g="0" b="0"/>
+      </a:lnRef>
+      <a:fillRef idx="1">
+        <a:scrgbClr r="0" g="0" b="0"/>
+      </a:fillRef>
+      <a:effectRef idx="0">
+        <a:scrgbClr r="0" g="0" b="0"/>
+      </a:effectRef>
+      <a:fontRef idx="minor"/>
+    </dgm:style>
+  </dgm:styleLbl>
+  <dgm:styleLbl name="bgShp">
+    <dgm:scene3d>
+      <a:camera prst="orthographicFront"/>
+      <a:lightRig rig="threePt" dir="t"/>
+    </dgm:scene3d>
+    <dgm:sp3d/>
+    <dgm:txPr/>
+    <dgm:style>
+      <a:lnRef idx="0">
+        <a:scrgbClr r="0" g="0" b="0"/>
+      </a:lnRef>
+      <a:fillRef idx="1">
+        <a:scrgbClr r="0" g="0" b="0"/>
+      </a:fillRef>
+      <a:effectRef idx="0">
+        <a:scrgbClr r="0" g="0" b="0"/>
+      </a:effectRef>
+      <a:fontRef idx="minor"/>
+    </dgm:style>
+  </dgm:styleLbl>
+  <dgm:styleLbl name="dkBgShp">
+    <dgm:scene3d>
+      <a:camera prst="orthographicFront"/>
+      <a:lightRig rig="threePt" dir="t"/>
+    </dgm:scene3d>
+    <dgm:sp3d/>
+    <dgm:txPr/>
+    <dgm:style>
+      <a:lnRef idx="0">
+        <a:scrgbClr r="0" g="0" b="0"/>
+      </a:lnRef>
+      <a:fillRef idx="1">
+        <a:scrgbClr r="0" g="0" b="0"/>
+      </a:fillRef>
+      <a:effectRef idx="0">
+        <a:scrgbClr r="0" g="0" b="0"/>
+      </a:effectRef>
+      <a:fontRef idx="minor"/>
+    </dgm:style>
+  </dgm:styleLbl>
+  <dgm:styleLbl name="trBgShp">
+    <dgm:scene3d>
+      <a:camera prst="orthographicFront"/>
+      <a:lightRig rig="threePt" dir="t"/>
+    </dgm:scene3d>
+    <dgm:sp3d/>
+    <dgm:txPr/>
+    <dgm:style>
+      <a:lnRef idx="0">
+        <a:scrgbClr r="0" g="0" b="0"/>
+      </a:lnRef>
+      <a:fillRef idx="1">
+        <a:scrgbClr r="0" g="0" b="0"/>
+      </a:fillRef>
+      <a:effectRef idx="0">
+        <a:scrgbClr r="0" g="0" b="0"/>
+      </a:effectRef>
+      <a:fontRef idx="minor"/>
+    </dgm:style>
+  </dgm:styleLbl>
+  <dgm:styleLbl name="fgShp">
+    <dgm:scene3d>
+      <a:camera prst="orthographicFront"/>
+      <a:lightRig rig="threePt" dir="t"/>
+    </dgm:scene3d>
+    <dgm:sp3d/>
+    <dgm:txPr/>
+    <dgm:style>
+      <a:lnRef idx="2">
+        <a:scrgbClr r="0" g="0" b="0"/>
+      </a:lnRef>
+      <a:fillRef idx="1">
+        <a:scrgbClr r="0" g="0" b="0"/>
+      </a:fillRef>
+      <a:effectRef idx="0">
+        <a:scrgbClr r="0" g="0" b="0"/>
+      </a:effectRef>
+      <a:fontRef idx="minor"/>
+    </dgm:style>
+  </dgm:styleLbl>
+  <dgm:styleLbl name="revTx">
+    <dgm:scene3d>
+      <a:camera prst="orthographicFront"/>
+      <a:lightRig rig="threePt" dir="t"/>
+    </dgm:scene3d>
+    <dgm:sp3d/>
+    <dgm:txPr/>
+    <dgm:style>
+      <a:lnRef idx="0">
+        <a:scrgbClr r="0" g="0" b="0"/>
+      </a:lnRef>
+      <a:fillRef idx="0">
+        <a:scrgbClr r="0" g="0" b="0"/>
+      </a:fillRef>
+      <a:effectRef idx="0">
+        <a:scrgbClr r="0" g="0" b="0"/>
+      </a:effectRef>
+      <a:fontRef idx="minor"/>
+    </dgm:style>
+  </dgm:styleLbl>
+</dgm:styleDef>
+</file>
+
 <file path=word/theme/theme1.xml><?xml version="1.0" encoding="utf-8"?>
 <a:theme xmlns:a="http://schemas.openxmlformats.org/drawingml/2006/main" name="Office Theme">
   <a:themeElements>

</xml_diff>